<commit_message>
models and half the jitters
</commit_message>
<xml_diff>
--- a/SAFE_snow_gmacs.docx
+++ b/SAFE_snow_gmacs.docx
@@ -125,16 +125,7 @@
         <w:pStyle w:val="BodyText"/>
       </w:pPr>
       <w:r>
-        <w:t xml:space="preserve">A total of 14 models are presented (</w:t>
-      </w:r>
-      <w:r>
-        <w:t xml:space="preserve">,</w:t>
-      </w:r>
-      <w:r>
-        <w:t xml:space="preserve"> </w:t>
-      </w:r>
-      <w:r>
-        <w:t xml:space="preserve">). Across the candidate models, point estimates of the directed Tier 3 OFL ranged from approximately 36 to 56 thousand tonnes (kt), with the magnitude driven primarily by whether the immature survey index was included (which had a larger influence on the the scale of</w:t>
+        <w:t xml:space="preserve">A total of 14 models are presented. Across the candidate models, point estimates of the directed Tier 3 OFL ranged from approximately 36 to 56 thousand tonnes (kt), with the magnitude driven primarily by whether the immature survey index was included (which had a larger influence on the the scale of</w:t>
       </w:r>
       <w:r>
         <w:t xml:space="preserve"> </w:t>
@@ -203,7 +194,7 @@
         <w:t xml:space="preserve"> </w:t>
       </w:r>
       <w:r>
-        <w:t xml:space="preserve">in the candidate models was generally between 0.87 and 1.02. No author preferred model or final OFL is recommended at this time – additional diagnostics, retrospective analyses, and Tier 4 calculations will be developed for the September document.</w:t>
+        <w:t xml:space="preserve">in the candidate models was generally between 0.87 and 1.02. No author preferred model or final OFL is recommended at this time – additional diagnostics, retrospective analyses, and Tier 4 calculations are recommended prior to the September document.</w:t>
       </w:r>
     </w:p>
     <w:p>
@@ -334,46 +325,28 @@
         </w:rPr>
         <w:t xml:space="preserve">Given that natural mortality events seem to switch among years and sexes depending on the model or input data, it would be prudent to investigate whether it is possible to estimate a direct link between natural mortality and a bottom temperature covariate of appropriate spatial and temporal scale.</w:t>
       </w:r>
-      <w:r>
-        <w:t xml:space="preserve"> </w:t>
-      </w:r>
-      <w:r>
-        <w:t xml:space="preserve">A manuscript describing both of these relationships for Bering Sea snow crab was presented in May/June 2024 (Figure 3;</w:t>
-      </w:r>
-      <w:r>
-        <w:t xml:space="preserve"> </w:t>
-      </w:r>
-      <w:r>
-        <w:t xml:space="preserve">“Density dependence can modulate climate change impacts on populations”</w:t>
-      </w:r>
-      <w:r>
-        <w:t xml:space="preserve">) and was published in 2026 (Szuwalski et al., 2026). In that manuscript, warmer temperatures were associated with elevated mortality and higher densities of large males were associated with lower probabilities of terminally molting at</w:t>
-      </w:r>
-      <w:r>
-        <w:t xml:space="preserve"> </w:t>
-      </w:r>
-      <w:r>
-        <w:t xml:space="preserve">size.</w:t>
-      </w:r>
     </w:p>
     <w:p>
       <w:pPr>
         <w:pStyle w:val="BodyText"/>
       </w:pPr>
       <w:r>
-        <w:t xml:space="preserve">The SSC responded to this presentation with the following text:</w:t>
+        <w:t xml:space="preserve">A manuscript describing both of these relationships for Bering Sea snow crab was presented in May/June 2024 (Figure 3;</w:t>
       </w:r>
       <w:r>
         <w:t xml:space="preserve"> </w:t>
       </w:r>
       <w:r>
-        <w:t xml:space="preserve">“The SSC emphasizes that projections of climate change impacts, while useful, are highly uncertain and. . . caution should be used when presenting</w:t>
+        <w:t xml:space="preserve">“Density dependence can modulate climate change impacts on populations”</w:t>
+      </w:r>
+      <w:r>
+        <w:t xml:space="preserve">) and was published in 2026 (Szuwalski et al., 2026). In that manuscript, warmer temperatures were associated with elevated mortality and higher densities of large males were associated with lower probabilities of terminally molting at</w:t>
       </w:r>
       <w:r>
         <w:t xml:space="preserve"> </w:t>
       </w:r>
       <w:r>
-        <w:t xml:space="preserve">these results.”</w:t>
+        <w:t xml:space="preserve">size.</w:t>
       </w:r>
     </w:p>
     <w:p>
@@ -381,19 +354,19 @@
         <w:pStyle w:val="BodyText"/>
       </w:pPr>
       <w:r>
-        <w:t xml:space="preserve">Clutch fullness does not appear to be related to the abundance of large-size crab based on analyses in</w:t>
+        <w:t xml:space="preserve">The SSC responded to this presentation with the following text:</w:t>
       </w:r>
       <w:r>
         <w:t xml:space="preserve"> </w:t>
       </w:r>
       <w:r>
-        <w:t xml:space="preserve">“Spatial depletion rates in the eastern Bering Sea snow crab fishery”</w:t>
+        <w:t xml:space="preserve">“The SSC emphasizes that projections of climate change impacts, while useful, are highly uncertain and. . . caution should be used when presenting</w:t>
       </w:r>
       <w:r>
         <w:t xml:space="preserve"> </w:t>
       </w:r>
       <w:r>
-        <w:t xml:space="preserve">(also presented in May 2024 and now in review for external publication). It is unclear if there is any relationship between clutch fullness and recruitment, though preliminary analyses suggest clutch fullness is not an important covariate for predicting recruitment strength.</w:t>
+        <w:t xml:space="preserve">these results.”</w:t>
       </w:r>
     </w:p>
     <w:p>
@@ -401,7 +374,19 @@
         <w:pStyle w:val="BodyText"/>
       </w:pPr>
       <w:r>
-        <w:t xml:space="preserve">These analyses come with the caveat that the Kodiak lab is revising their methods for analyzing the maturity data for snow crab.</w:t>
+        <w:t xml:space="preserve">Clutch fullness does not appear to be related to the abundance of large-size crab based on analyses in</w:t>
+      </w:r>
+      <w:r>
+        <w:t xml:space="preserve"> </w:t>
+      </w:r>
+      <w:r>
+        <w:t xml:space="preserve">“Spatial depletion rates in the eastern Bering Sea snow crab fishery”</w:t>
+      </w:r>
+      <w:r>
+        <w:t xml:space="preserve"> </w:t>
+      </w:r>
+      <w:r>
+        <w:t xml:space="preserve">(also presented in May 2024 and now in review for external publication). It is unclear if there is any relationship between clutch fullness and recruitment, though preliminary analyses suggest clutch fullness is not an important covariate for predicting recruitment strength.</w:t>
       </w:r>
     </w:p>
     <w:p>
@@ -409,24 +394,34 @@
         <w:pStyle w:val="BodyText"/>
       </w:pPr>
       <w:r>
+        <w:t xml:space="preserve">These analyses come with the caveat that the Kodiak lab is revising their methods for analyzing the maturity data for snow crab.</w:t>
+      </w:r>
+    </w:p>
+    <w:p>
+      <w:pPr>
+        <w:pStyle w:val="BodyText"/>
+      </w:pPr>
+      <w:r>
         <w:rPr>
           <w:i/>
           <w:iCs/>
         </w:rPr>
         <w:t xml:space="preserve">2025(6) SSC. To explore development of an ABC control rule, the SSC requests that a yield per recruit analysis be developed for snow crab.</w:t>
       </w:r>
-      <w:r>
-        <w:t xml:space="preserve"> </w:t>
-      </w:r>
-      <w:r>
-        <w:t xml:space="preserve">Time did not allow for this exercise.</w:t>
-      </w:r>
     </w:p>
     <w:p>
       <w:pPr>
         <w:pStyle w:val="BodyText"/>
       </w:pPr>
       <w:r>
+        <w:t xml:space="preserve">Time did not allow for this exercise.</w:t>
+      </w:r>
+    </w:p>
+    <w:p>
+      <w:pPr>
+        <w:pStyle w:val="BodyText"/>
+      </w:pPr>
+      <w:r>
         <w:rPr>
           <w:i/>
           <w:iCs/>
@@ -453,108 +448,120 @@
         </w:rPr>
         <w:t xml:space="preserve">2024(10) SSC. The SSC highlighted that more research is needed on the basic reproductive biology of snow crab, specifically addressing the question of whether small males can and do mate with large females and produce progeny that will be large males under the right environmental conditions. The SSC strongly supports the proposed collaborative research to explore in situ observations of mating crab using a camera sled.</w:t>
       </w:r>
-      <w:r>
-        <w:t xml:space="preserve"> </w:t>
-      </w:r>
-      <w:r>
-        <w:t xml:space="preserve">We agree and no new research has been conducted within this timeframe.</w:t>
-      </w:r>
     </w:p>
     <w:p>
       <w:pPr>
         <w:pStyle w:val="BodyText"/>
       </w:pPr>
       <w:r>
+        <w:t xml:space="preserve">We agree and no new research has been conducted within this timeframe.</w:t>
+      </w:r>
+    </w:p>
+    <w:p>
+      <w:pPr>
+        <w:pStyle w:val="BodyText"/>
+      </w:pPr>
+      <w:r>
         <w:rPr>
           <w:i/>
           <w:iCs/>
         </w:rPr>
         <w:t xml:space="preserve">2024(10) SSC. The highest priority would be to continue to refine the Maximin analysis as requested by the SSC in June 2024, specially using values of steepness of 0.50, 0.67, and 0.80, and considering both the Beverton-Holt and Ricker stock recruitment relationships. The yield analysis also indicated that fishing mortality rates much lower than F35% achieved a high percentage of MSY, indicating potential flexibility in specifying reference points. The SSC suggested that some type of collaborative work during the spring, perhaps including SSC members and/or others might facilitate additional progress on this topic. The SSC is interested in developing a wider range of options for reference points for snow crab for consideration in the next assessment cycle.</w:t>
       </w:r>
-      <w:r>
-        <w:t xml:space="preserve"> </w:t>
-      </w:r>
-      <w:r>
-        <w:t xml:space="preserve">The analysis was not extended beyond what was presented in appendix A of the 2024 SAFE and would be of limited use until we know more about reproductive contribution of large male snow crab. The specific values for steepness noted by the SSC are arbitrary and do not match observations, estimates, or available data on the reproductive dynamics of snow crab. Until then, we know that the fishery will not exist without large males and we know that the large males are at historical lows, so we should focus our efforts on understanding the dynamics of large males.</w:t>
-      </w:r>
     </w:p>
     <w:p>
       <w:pPr>
         <w:pStyle w:val="BodyText"/>
       </w:pPr>
       <w:r>
+        <w:t xml:space="preserve">The analysis was not extended beyond what was presented in appendix A of the 2024 SAFE and would be of limited use until we know more about reproductive contribution of large male snow crab. The specific values for steepness noted by the SSC are arbitrary and do not match observations, estimates, or available data on the reproductive dynamics of snow crab. Until then, we know that the fishery will not exist without large males and we know that the large males are at historical lows, so we should focus our efforts on understanding the dynamics of large males.</w:t>
+      </w:r>
+    </w:p>
+    <w:p>
+      <w:pPr>
+        <w:pStyle w:val="BodyText"/>
+      </w:pPr>
+      <w:r>
         <w:rPr>
           <w:i/>
           <w:iCs/>
         </w:rPr>
         <w:t xml:space="preserve">2024(10) SSC. The SSC again requests an analysis of the probability of maturing/terminal molt which addresses the observation error in these data and the lack of a monotonically increasing curve. A hierarchical analysis that treats years as random effects might be a starting point. The SSC would also like to better understand the sampling design for the molt data and is concerned about the weighting of the spatial samples in the analysis; weighting should be based on abundance if the sampling rate differs by area (which it would, unless abundance were uniform and/or the targets were in direct proportion to abundance).</w:t>
       </w:r>
-      <w:r>
-        <w:t xml:space="preserve"> </w:t>
-      </w:r>
-      <w:r>
-        <w:t xml:space="preserve">The Kodiak lab gave a presentation describing how these data are analyzed. Potential changes to this workflow produces different values for the probability of having undergone terminal molt. Two models runs are included within the 2025 preliminary assessment and the current document to explore the impact of different assumptions about the probability of terminal molt.</w:t>
-      </w:r>
     </w:p>
     <w:p>
       <w:pPr>
         <w:pStyle w:val="BodyText"/>
       </w:pPr>
       <w:r>
+        <w:t xml:space="preserve">The Kodiak lab gave a presentation describing how these data are analyzed. Potential changes to this workflow produces different values for the probability of having undergone terminal molt. Two models runs are included within the 2025 preliminary assessment and the current document to explore the impact of different assumptions about the probability of terminal molt.</w:t>
+      </w:r>
+    </w:p>
+    <w:p>
+      <w:pPr>
+        <w:pStyle w:val="BodyText"/>
+      </w:pPr>
+      <w:r>
         <w:rPr>
           <w:i/>
           <w:iCs/>
         </w:rPr>
         <w:t xml:space="preserve">2024(10) SSC. Investigate whether there is information outside the assessment model (e.g., larval or post-settlement data) or in the model, supporting estimated skewed sex-ratios at recruitment and the mismatch between recent large recruitments for males and females occurring in different years. Explore whether the estimated large differences in male and female recruitment years could be related to the lack of fit to molt-increment data.</w:t>
       </w:r>
-      <w:r>
-        <w:t xml:space="preserve"> </w:t>
-      </w:r>
-      <w:r>
-        <w:t xml:space="preserve">No new information has come to light on why this might be the case. Previous discussion centered around the possibility that different spatial distributions by sex of small crab could expose them to different environments, which could alter what we perceive as recruitment five years after settlement. While this difference is an interesting scientific question to pursue, solving it will not address the central problem in management: commercially preferred males are at historic lows over the last decade. Removing the females from the model entirely might be a prudent step towards focusing on the most pressing management problem at hand given conflicting trends.</w:t>
-      </w:r>
     </w:p>
     <w:p>
       <w:pPr>
         <w:pStyle w:val="BodyText"/>
       </w:pPr>
       <w:r>
+        <w:t xml:space="preserve">No new information has come to light on why this might be the case. Previous discussion centered around the possibility that different spatial distributions by sex of small crab could expose them to different environments, which could alter what we perceive as recruitment five years after settlement. While this difference is an interesting scientific question to pursue, solving it will not address the central problem in management: commercially preferred males are at historic lows over the last decade. Removing the females from the model entirely might be a prudent step towards focusing on the most pressing management problem at hand given conflicting trends.</w:t>
+      </w:r>
+    </w:p>
+    <w:p>
+      <w:pPr>
+        <w:pStyle w:val="BodyText"/>
+      </w:pPr>
+      <w:r>
         <w:rPr>
           <w:i/>
           <w:iCs/>
         </w:rPr>
         <w:t xml:space="preserve">2024(10) SSC. Geostatistical (e.g. VAST) modeling of trawl survey data including both the NBS and EBS should be prioritized. This could help understand some of the inconsistent recruitment/growth trends observed in recent years as well as prepare for potential changes in stock distribution or productivity under future warming of the Bering Sea. Geostatistical modeling should evaluate alternative error distributions and other model configurations as appropriate.</w:t>
       </w:r>
-      <w:r>
-        <w:t xml:space="preserve"> </w:t>
-      </w:r>
-      <w:r>
-        <w:t xml:space="preserve">The Kodiak lab presented indices for mature females and large males in the 2025 May CPT.</w:t>
-      </w:r>
     </w:p>
     <w:p>
       <w:pPr>
         <w:pStyle w:val="BodyText"/>
       </w:pPr>
       <w:r>
+        <w:t xml:space="preserve">The Kodiak lab presented indices for mature females and large males in the 2025 May CPT.</w:t>
+      </w:r>
+    </w:p>
+    <w:p>
+      <w:pPr>
+        <w:pStyle w:val="BodyText"/>
+      </w:pPr>
+      <w:r>
         <w:rPr>
           <w:i/>
           <w:iCs/>
         </w:rPr>
         <w:t xml:space="preserve">2024(6) CPT. Tier 4 fallback - CPT supports: The author suggested an alternative for snow crab to the basic Tier 4 calculation that is being brought forward for other stocks. Specifically, a fallback Tier 4 option would be calculated as the vulnerable biomass in this year’s survey (not smoothed, and vulnerable defined by a cutoff of 95 mm CW), decremented by the proportion of natural mortality that occurs between the time of the survey and the fishery, and M applied as the proxy for FMSY to calculate the Tier 4 OFL. The motivations identified for using the annual survey design-based estimate of vulnerable biomass rather than a REMA smooth through the survey time series were: 1) that the high number of positive stations for snow crab on survey (238 stations in 2023) make the design-based estimate a robust measure of annual biomass; and 2) that the large interannual fluctuations in biomass observed in some recent years would be poorly captured by a smooth. The motivation for decrementing the biomass estimate by the proportion of natural mortality occurring between the survey and the fishery is that failing to account for this mortality could lead to unintentionally high values of F if the Tier 4 fallback was used.</w:t>
       </w:r>
-      <w:r>
-        <w:t xml:space="preserve"> </w:t>
-      </w:r>
-      <w:r>
-        <w:t xml:space="preserve">No response.</w:t>
-      </w:r>
     </w:p>
     <w:p>
       <w:pPr>
         <w:pStyle w:val="BodyText"/>
       </w:pPr>
       <w:r>
+        <w:t xml:space="preserve">No response.</w:t>
+      </w:r>
+    </w:p>
+    <w:p>
+      <w:pPr>
+        <w:pStyle w:val="BodyText"/>
+      </w:pPr>
+      <w:r>
         <w:rPr>
           <w:i/>
           <w:iCs/>
@@ -581,9 +588,11 @@
         </w:rPr>
         <w:t xml:space="preserve">2024(6) SSC. The SSC recommends that this model be brought forward in the fall but requests that an additional Tier 4 model be provided for comparison, as recommended in the Simpler Modeling Workshop report and requested in the SSC’s June 2023 and October 2023 Reports. This additional model would use the random effects model (REMA) to smooth survey estimates and would not decrement with natural mortality.</w:t>
       </w:r>
-      <w:r>
-        <w:t xml:space="preserve"> </w:t>
-      </w:r>
+    </w:p>
+    <w:p>
+      <w:pPr>
+        <w:pStyle w:val="BodyText"/>
+      </w:pPr>
       <w:r>
         <w:t xml:space="preserve">This is included in 2024 SAFE document.</w:t>
       </w:r>
@@ -736,25 +745,13 @@
         <w:pStyle w:val="FirstParagraph"/>
       </w:pPr>
       <w:r>
-        <w:t xml:space="preserve">A total of 14 models were explored All models share the structural assumptions described above and differ only in the version of GMACs, their data inputs, the specification of the maturity ogive, and the definition of the plus group. The naming convention reflects an additive series of changes layered onto the September 2025 model (</w:t>
+        <w:t xml:space="preserve">A total of 14 models were explored. All models share the same structural assumptions described above and differ only in the version of GMACs, their data inputs, specification of the maturity ogive, and the definition of the plus group. The naming convention reflects an additive series of changes layered onto the September 2025 model (</w:t>
       </w:r>
       <w:r>
         <w:t xml:space="preserve">‘25.1 gmacs’</w:t>
       </w:r>
       <w:r>
-        <w:t xml:space="preserve">). The full set of folders and the corresponding labels used in the figures and tables are defined in</w:t>
-      </w:r>
-      <w:r>
-        <w:t xml:space="preserve"> </w:t>
-      </w:r>
-      <w:r>
-        <w:rPr>
-          <w:rStyle w:val="VerbatimChar"/>
-        </w:rPr>
-        <w:t xml:space="preserve">0-models.R</w:t>
-      </w:r>
-      <w:r>
-        <w:t xml:space="preserve">.</w:t>
+        <w:t xml:space="preserve">).</w:t>
       </w:r>
     </w:p>
     <w:p>
@@ -902,7 +899,7 @@
         <w:t xml:space="preserve"> </w:t>
       </w:r>
       <w:r>
-        <w:t xml:space="preserve">model (29 min, 2 sec) and provides the structural backbone for several of the sensitivities below.</w:t>
+        <w:t xml:space="preserve">model (29 min, 2 sec) and provides the basis for several of the sensitivities below.</w:t>
       </w:r>
     </w:p>
     <w:p>
@@ -1014,7 +1011,7 @@
         <w:t xml:space="preserve"> </w:t>
       </w:r>
       <w:r>
-        <w:t xml:space="preserve">spatiotemporal model fit to chela-based maturity classifications to produce a smoothed probability of being mature at size and location, integrated to a population-level annual ogive. The updated time series shows a much weaker temporal trend in the probability of terminal molt at intermediate sizes (e.g., at 77 mm) than the previous workflow. The updated maturity ogive resulted in differing time-series of mature male survey abundance and mature and immature male composition data.</w:t>
+        <w:t xml:space="preserve">spatiotemporal model fit to chela-based maturity classifications to produce a smoothed probability of being mature at size and location, integrated to a population-level annual ogive. The updated time series shows a much weaker temporal trend in the probability of terminal molt at intermediate sizes (e.g., at 77 mm) than the previous workflow. The updated maturity ogive resulted in differing time-series of mature male survey abundance and mature and immature male composition data. Note that the cv and sample size for both data sets were not adjusted.</w:t>
       </w:r>
     </w:p>
     <w:p>
@@ -1096,7 +1093,7 @@
         <w:pStyle w:val="FirstParagraph"/>
       </w:pPr>
       <w:r>
-        <w:t xml:space="preserve">Hybrid scenarios.</w:t>
+        <w:t xml:space="preserve">Hybrid scenarios:</w:t>
       </w:r>
     </w:p>
     <w:p>
@@ -1141,7 +1138,7 @@
         <w:t xml:space="preserve"> </w:t>
       </w:r>
       <w:r>
-        <w:t xml:space="preserve">– the plus-group model with hybrids added to the directed-fishery composition and discard time-series. The CV on directed discards is held at 0.7. The retained male time-series uses is identical to the snow-crab retained file because retained catch already contains hybrids and not seperately recorded. Observer non-directed bycatch is left unchanged.</w:t>
+        <w:t xml:space="preserve">– the plus-group model with hybrids added to the directed-fishery composition and discard time-series. The CV on directed discards is held at 0.7. The retained male time-series uses is identical to the snow-crab retained file because retained catch already contains hybrids as they are not separately recorded. Observer non-directed bycatch is left unchanged.</w:t>
       </w:r>
     </w:p>
     <w:p>
@@ -1246,21 +1243,7 @@
         <w:t xml:space="preserve"> </w:t>
       </w:r>
       <w:r>
-        <w:t xml:space="preserve">and the new maturity workflow.</w:t>
-      </w:r>
-    </w:p>
-    <w:p>
-      <w:pPr>
-        <w:pStyle w:val="FirstParagraph"/>
-      </w:pPr>
-      <w:r>
-        <w:t xml:space="preserve">@Cody</w:t>
-      </w:r>
-      <w:r>
-        <w:t xml:space="preserve"> </w:t>
-      </w:r>
-      <w:r>
-        <w:t xml:space="preserve">TODO: update survey indices and comp for models with hybrids and newmat. Mat was only updated in ctl file. Script is super buggy.</w:t>
+        <w:t xml:space="preserve">and the new maturity workflow. Males snow crab and hybrids were apportioned to immature and mature using the new maturity ogive.</w:t>
       </w:r>
     </w:p>
     <w:bookmarkEnd w:id="24"/>
@@ -1288,7 +1271,7 @@
         <w:pStyle w:val="FirstParagraph"/>
       </w:pPr>
       <w:r>
-        <w:t xml:space="preserve">The Generalized Model for Assessing Crustacean Stocks (GMACS) was adopted as the assessment platform for snow crab in 2022 after a demonstration that GMACS could effectively reproduce the dynamics of the status quo model and offered structural improvements. GMACS is an integrated, size-structured model developed using automatic differentiation software developed as a set of libraries under C++ (ADModel Builder). ADModel Builder can estimate a large number of parameters in a non-linear model using automatic differentiation software extended from Greiwank and Corliss (1991) and developed into C++ class libraries. GMACS version 2.20.32b was used for the author-preferred model.</w:t>
+        <w:t xml:space="preserve">The Generalized Model for Assessing Crustacean Stocks (GMACS) was adopted as the assessment platform for snow crab in 2022 after a demonstration that GMACS could effectively reproduce the dynamics of the status quo model and offered structural improvements. GMACS is an integrated, size-structured model developed using automatic differentiation software developed as a set of libraries under C++ (ADModel Builder). ADModel Builder can estimate a large number of parameters in a non-linear model using automatic differentiation software extended from Greiwank and Corliss (1991) and developed into C++ class libraries. GMACS version 2.20.34 was used for the author-preferred model after the January 2026 CPT.</w:t>
       </w:r>
     </w:p>
     <w:p>
@@ -1394,27 +1377,7 @@
         <w:t xml:space="preserve"> </w:t>
       </w:r>
       <w:r>
-        <w:t xml:space="preserve">approach has been historically used to explore the impact of different starting values on the assessment output (Turnock, 2016). Jittering was implemented for both models with 2025 data. Retrospective analyses were also performed here in which the terminal year of data was removed sequentially from the model fitting process. Then time series of estimated MMB were compared between the most recent model and successive</w:t>
-      </w:r>
-      <w:r>
-        <w:t xml:space="preserve"> </w:t>
-      </w:r>
-      <w:r>
-        <w:t xml:space="preserve">‘peels’</w:t>
-      </w:r>
-      <w:r>
-        <w:t xml:space="preserve"> </w:t>
-      </w:r>
-      <w:r>
-        <w:t xml:space="preserve">of the data to identify retrospective patterns. A retrospective pattern is a consistent directional change in assessment estimates of management quantities (e.g. MMB) in a given year when additional years of data are added to an assessment. Parameter values were jittered based on a normal distribution centered on one with a standard deviation of 0.1 that was then translated to the parameter space defined by the initial value and its bounds.</w:t>
-      </w:r>
-    </w:p>
-    <w:p>
-      <w:pPr>
-        <w:pStyle w:val="BodyText"/>
-      </w:pPr>
-      <w:r>
-        <w:t xml:space="preserve">A single population dynamics model is presented here, with the differences among the model runs related to data inputs and assumptions about reference points or currency of management.</w:t>
+        <w:t xml:space="preserve">approach has been historically used to explore the impact of different starting values on the assessment output (Turnock, 2016). Jittering was implemented select both models with 2025 data. Parameter values were jittered based on a normal distribution centered on one with a standard deviation of 0.1 that was then translated to the parameter space defined by the initial value and its bounds.</w:t>
       </w:r>
     </w:p>
     <w:bookmarkEnd w:id="26"/>
@@ -1432,7 +1395,7 @@
         <w:pStyle w:val="FirstParagraph"/>
       </w:pPr>
       <w:r>
-        <w:t xml:space="preserve">Models were evaluated based on their fit to the data, evidence of non-convergence, the credibility of the estimated population processes, and the strength of the influence of the assumptions of the model on the outcomes of the assessment. Note that for some of the model scenarios, data inputs are different and, therefore, model fits are not directly compareable.</w:t>
+        <w:t xml:space="preserve">Models were evaluated based on their fit to the data, evidence of non-convergence, the credibility of the estimated population processes, and the strength of the influence of the assumptions of the model on the outcomes of the assessment. Note that for some of the model scenarios, data inputs are different and, therefore, model fits are not directly comparable.</w:t>
       </w:r>
     </w:p>
     <w:bookmarkEnd w:id="27"/>
@@ -1460,7 +1423,7 @@
         <w:pStyle w:val="FirstParagraph"/>
       </w:pPr>
       <w:r>
-        <w:t xml:space="preserve">All 14 models presented here produced small maximum gradients and Hessian matrices. As in past cycles, jittering was used to evaluate sensitivity to starting values: parameter values were jittered based on a normal distribution centered on one with a standard deviation of 0.1, translated to the parameter space defined by the initial value and its bounds. One hundred jitters were run for four models that span the range of structural and data choices –</w:t>
+        <w:t xml:space="preserve">All 14 models presented here produced small maximum gradients and Hessian matrices. As in past cycles, jittering was used to evaluate sensitivity to starting values: parameter values were jittered based on a normal distribution centered on one with a standard deviation of 0.1, translated to the parameter space defined by the initial value and its bounds. One hundred jitters were run for six models that span the range of structural and data choices –</w:t>
       </w:r>
       <w:r>
         <w:t xml:space="preserve"> </w:t>
@@ -1487,19 +1450,34 @@
         <w:t xml:space="preserve">‘25.1 gmacs (update + hyb_both)’</w:t>
       </w:r>
       <w:r>
+        <w:t xml:space="preserve">,</w:t>
+      </w:r>
+      <w:r>
+        <w:t xml:space="preserve"> </w:t>
+      </w:r>
+      <w:r>
+        <w:t xml:space="preserve">‘25.1 gmacs (update + hyb_both + new_mat)’</w:t>
+      </w:r>
+      <w:r>
+        <w:t xml:space="preserve">,</w:t>
+      </w:r>
+      <w:r>
+        <w:t xml:space="preserve"> </w:t>
+      </w:r>
+      <w:r>
+        <w:t xml:space="preserve">‘25.1 gmacs (update + imm_surv + plus group)’</w:t>
+      </w:r>
+      <w:r>
         <w:t xml:space="preserve">, and</w:t>
       </w:r>
       <w:r>
         <w:t xml:space="preserve"> </w:t>
       </w:r>
       <w:r>
-        <w:t xml:space="preserve">‘25.1 gmacs (update + hyb_both + new_mat)’</w:t>
-      </w:r>
-      <w:r>
-        <w:t xml:space="preserve">(</w:t>
-      </w:r>
-      <w:r>
-        <w:t xml:space="preserve">).</w:t>
+        <w:t xml:space="preserve">‘25.1 gmacs (update + newmat + imm_surv + plus group)’</w:t>
+      </w:r>
+      <w:r>
+        <w:t xml:space="preserve">.</w:t>
       </w:r>
     </w:p>
     <w:p>
@@ -1529,10 +1507,7 @@
         <w:t xml:space="preserve">‘25.1 gmacs (update + imm_surv + plus group)’</w:t>
       </w:r>
       <w:r>
-        <w:t xml:space="preserve">) eliminates the bimodality entirely – jitter runs converge to a single cloud of solutions (</w:t>
-      </w:r>
-      <w:r>
-        <w:t xml:space="preserve">). This is an encouraging diagnostic, but the immature-index model also produces a substantially smaller</w:t>
+        <w:t xml:space="preserve">) eliminates the bimodality entirely – jitter runs converge to a single cloud of solutions. This is an encouraging diagnostic, but the immature-index model also produces a substantially smaller</w:t>
       </w:r>
       <w:r>
         <w:t xml:space="preserve"> </w:t>
@@ -1561,7 +1536,7 @@
         <w:t xml:space="preserve"> </w:t>
       </w:r>
       <w:r>
-        <w:t xml:space="preserve">and a much higher mature male natural mortality (see below), so the apparent fix should not be interpreted as an unqualified improvement. The recent history of bimodality in this assessment (Turnock, 2016) suggests that resolving the underlying source of multiple optima will require careful follow-up before September.</w:t>
+        <w:t xml:space="preserve">and a much higher mature male natural mortality (see below), so the apparent fix should not be interpreted as an unqualified improvement. The recent history of bimodality in this assessment (Turnock, 2016) suggests that resolving the underlying source of multiple optima will require further evaluation before September.</w:t>
       </w:r>
     </w:p>
     <w:p>
@@ -1590,16 +1565,7 @@
         <w:t xml:space="preserve"> </w:t>
       </w:r>
       <w:r>
-        <w:t xml:space="preserve">models) shifts the estimated population dynamics modestly but does not resolve the female terminal-year fit (</w:t>
-      </w:r>
-      <w:r>
-        <w:t xml:space="preserve">,</w:t>
-      </w:r>
-      <w:r>
-        <w:t xml:space="preserve"> </w:t>
-      </w:r>
-      <w:r>
-        <w:t xml:space="preserve">).</w:t>
+        <w:t xml:space="preserve">models) shifts the estimated population dynamics modestly but does not resolve the female terminal-year fit.</w:t>
       </w:r>
     </w:p>
     <w:bookmarkEnd w:id="29"/>
@@ -1617,10 +1583,7 @@
         <w:pStyle w:val="FirstParagraph"/>
       </w:pPr>
       <w:r>
-        <w:t xml:space="preserve">Fits to the survey indices of mature biomass were broadly similar across the models (</w:t>
-      </w:r>
-      <w:r>
-        <w:t xml:space="preserve">). The hybrid-survey models produce visibly higher predicted survey biomass in some years (the additional hybrid biomass is added to the snow-crab time-series), but the trend through time is unchanged. The models with the immature survey index (</w:t>
+        <w:t xml:space="preserve">Fits to the survey indices of mature biomass were broadly similar across the models. The hybrid-survey models produce visibly higher predicted survey biomass in some years (the additional hybrid biomass is added to the snow-crab time-series), but the trend through time is unchanged. The models with the immature survey index (</w:t>
       </w:r>
       <w:r>
         <w:t xml:space="preserve">‘imm_surv’</w:t>
@@ -1634,10 +1597,7 @@
         <w:pStyle w:val="BodyText"/>
       </w:pPr>
       <w:r>
-        <w:t xml:space="preserve">Fits to the non-directed fishery catches were good for all models (</w:t>
-      </w:r>
-      <w:r>
-        <w:t xml:space="preserve">). Fits to the directed-fishery retained catch were also good across the model set. Fits to the directed-fishery discard time-series differ in the hybrid-fishery models because the observed discards in those models include hybrid crab (and so are larger; e.g., ~18 kt of legal-male hybrid catch in 1997 reported by ADF&amp;G with the caveat that observer hybrid identification quality decreases the further back in time one looks). The models accommodate the additional discards primarily through changes in estimated discard fishing mortality rather than through major changes in selectivity.</w:t>
+        <w:t xml:space="preserve">Fits to the non-directed fishery catches were good for all models. Fits to the directed-fishery retained catch were also good across the model set. Fits to the directed-fishery discard time-series differ in the hybrid-fishery models because the observed discards in those models include hybrid crab (and so are larger; e.g., ~18 kt of legal-male hybrid catch in 1997 reported by ADF&amp;G with the caveat that observer hybrid identification quality decreases the further back in time one looks). The models accommodate the additional discards primarily through changes in estimated discard fishing mortality rather than through major changes in selectivity.</w:t>
       </w:r>
     </w:p>
     <w:p>
@@ -1645,7 +1605,7 @@
         <w:pStyle w:val="BodyText"/>
       </w:pPr>
       <w:r>
-        <w:t xml:space="preserve">Differences among models in the fits to size composition data for retained catch in the directed fishery are small (size composition figures, below). Fits to the total size composition data from the directed fishery differ noticeably between the standard and the hybrid-fishery models, particularly for the larger size bins where hybrids are most prevalent. No visually discernible differences among models existed for female discards from the directed fishery. Fits to the non-directed fishery had some of the largest misfits of all data sources (particularly for male data), but this is unsurprising given a single estimated selectivity curve and potential changes in fishery behavior over time.</w:t>
+        <w:t xml:space="preserve">Differences among models in the fits to size composition data for retained catch in the directed fishery are small (size composition figures, below). Fits to the total size composition data from the directed fishery differ noticeably between the standard and the hybrid-fishery models, particularly for the larger size bins where hybrids are most prevalent. No visually discernible differences among models existed for female discards from the directed fishery. Fits to the non-directed fishery had some of the largest misfits of all data sources (particularly for male data), but this is unsurprising given a single estimated selectivity curve and changes in fishery behavior over time.</w:t>
       </w:r>
     </w:p>
     <w:p>
@@ -1671,13 +1631,7 @@
         <w:pStyle w:val="FirstParagraph"/>
       </w:pPr>
       <w:r>
-        <w:t xml:space="preserve">The estimated abundance of commercially preferred male crab (&gt;=101 mm carapace width; arguably the most important output of the assessment) varied among models (</w:t>
-      </w:r>
-      <w:r>
-        <w:t xml:space="preserve">). The early years during which differences in survey selectivity occurred were particularly different. All models agreed that the abundance in recent years has been the lowest in the time series. The estimates of the most recent era of survey selectivity were similar across models for both sexes (</w:t>
-      </w:r>
-      <w:r>
-        <w:t xml:space="preserve">).</w:t>
+        <w:t xml:space="preserve">The estimated abundance of commercially preferred male crab (&gt;=101 mm carapace width) varied among models. The early years during which differences in survey selectivity occurred were particularly different. All models agreed that the abundance in recent years has been the lowest in the time series. The estimates of the most recent era of survey selectivity were similar across models for both sexes.</w:t>
       </w:r>
     </w:p>
     <w:p>
@@ -1685,19 +1639,7 @@
         <w:pStyle w:val="BodyText"/>
       </w:pPr>
       <w:r>
-        <w:t xml:space="preserve">Estimated fisheries selectivities were similar across models (</w:t>
-      </w:r>
-      <w:r>
-        <w:t xml:space="preserve">). Estimated fully-selected fishing mortality for the directed fishery was highly variable and relatively high for most of the fishery history (</w:t>
-      </w:r>
-      <w:r>
-        <w:t xml:space="preserve">). The total fishery selectivity curve is shifted far to the right, so only the largest crab experience the fully-selected fishing mortality. The probability of undergoing terminal molt is input as data; the standard workflow produces a strong increasing trend through time at intermediate sizes (e.g., at 77 mm the probability rose from ~0.2 in the early 1990s to ~0.5 after 2010), while the new maturity workflow produces a much weaker temporal trend (~0.35–0.45 throughout the time series;</w:t>
-      </w:r>
-      <w:r>
-        <w:t xml:space="preserve"> </w:t>
-      </w:r>
-      <w:r>
-        <w:t xml:space="preserve">). The new workflow uses a spatiotemporal</w:t>
+        <w:t xml:space="preserve">Estimated fisheries selectivities were similar across models. Estimated fully-selected fishing mortality for the directed fishery was highly variable and relatively high for most of the fishery history. The total fishery selectivity curve is shifted far to the right, so only the largest crab experience the fully-selected fishing mortality. The probability of undergoing terminal molt is input as data; the standard workflow produces a strong increasing trend through time at intermediate sizes (e.g., at 77 mm the probability rose from ~0.2 in the early 1990s to ~0.5 after 2010), while the new maturity workflow produces a much weaker temporal trend (~0.35–0.45 throughout the time series). The new workflow uses a spatiotemporal</w:t>
       </w:r>
       <w:r>
         <w:t xml:space="preserve"> </w:t>
@@ -1720,10 +1662,7 @@
         <w:pStyle w:val="BodyText"/>
       </w:pPr>
       <w:r>
-        <w:t xml:space="preserve">Trends in recruitment were very similar across models for the early time series, with some variability in scale and differences in timing between the sexes (</w:t>
-      </w:r>
-      <w:r>
-        <w:t xml:space="preserve">). Differences in estimated recruitment in the most recent years were observed among models for males and contribute to differences in OFLs across the model set.</w:t>
+        <w:t xml:space="preserve">Trends in recruitment were very similar across models for the early time series, with some variability in scale and differences in timing between the sexes. Differences in estimated recruitment in the most recent years were observed among models for males and contribute to differences in OFLs across the model set.</w:t>
       </w:r>
     </w:p>
     <w:p>
@@ -1731,10 +1670,7 @@
         <w:pStyle w:val="BodyText"/>
       </w:pPr>
       <w:r>
-        <w:t xml:space="preserve">Base estimates of natural mortality for mature animals of both sexes were broadly similar across models, with one important exception: the model with the immature survey index produces a substantially higher mature male natural mortality than the other models (</w:t>
-      </w:r>
-      <w:r>
-        <w:t xml:space="preserve">). All models estimated additional mortality events that removed at least 80% of crab by sex and maturity state (except for mature females) at some point during the marine heatwave of 2018–19.</w:t>
+        <w:t xml:space="preserve">Base estimates of natural mortality for mature animals of both sexes were broadly similar across models, with one important exception: the model with the immature survey index produces a substantially higher mature male natural mortality than the other models. All models estimated additional mortality events that removed at least 80% of crab by sex and maturity state (except for mature females) at some point during the marine heatwave of 2018–19.</w:t>
       </w:r>
     </w:p>
     <w:bookmarkEnd w:id="31"/>
@@ -2192,10 +2128,336 @@
       <w:pPr>
         <w:pStyle w:val="BodyText"/>
       </w:pPr>
+      <m:oMathPara>
+        <m:oMathParaPr>
+          <m:jc m:val="center"/>
+        </m:oMathParaPr>
+        <m:oMath>
+          <m:sSub>
+            <m:e>
+              <m:r>
+                <m:t>F</m:t>
+              </m:r>
+            </m:e>
+            <m:sub>
+              <m:r>
+                <m:t>O</m:t>
+              </m:r>
+              <m:r>
+                <m:t>F</m:t>
+              </m:r>
+              <m:r>
+                <m:t>L</m:t>
+              </m:r>
+            </m:sub>
+          </m:sSub>
+          <m:r>
+            <m:rPr>
+              <m:sty m:val="p"/>
+            </m:rPr>
+            <m:t>=</m:t>
+          </m:r>
+          <m:d>
+            <m:dPr>
+              <m:begChr m:val="{"/>
+              <m:sepChr m:val=""/>
+              <m:endChr m:val=""/>
+              <m:grow/>
+            </m:dPr>
+            <m:e>
+              <m:m>
+                <m:mPr>
+                  <m:baseJc m:val="center"/>
+                  <m:plcHide m:val="on"/>
+                  <m:mcs>
+                    <m:mc>
+                      <m:mcPr>
+                        <m:mcJc m:val="left"/>
+                        <m:count m:val="1"/>
+                      </m:mcPr>
+                    </m:mc>
+                    <m:mc>
+                      <m:mcPr>
+                        <m:mcJc m:val="left"/>
+                        <m:count m:val="1"/>
+                      </m:mcPr>
+                    </m:mc>
+                  </m:mcs>
+                </m:mPr>
+                <m:mr>
+                  <m:e>
+                    <m:r>
+                      <m:t>B</m:t>
+                    </m:r>
+                    <m:r>
+                      <m:t>y</m:t>
+                    </m:r>
+                    <m:r>
+                      <m:t>c</m:t>
+                    </m:r>
+                    <m:r>
+                      <m:t>a</m:t>
+                    </m:r>
+                    <m:r>
+                      <m:t>t</m:t>
+                    </m:r>
+                    <m:r>
+                      <m:t>c</m:t>
+                    </m:r>
+                    <m:r>
+                      <m:t>h</m:t>
+                    </m:r>
+                  </m:e>
+                  <m:e>
+                    <m:r>
+                      <m:t>i</m:t>
+                    </m:r>
+                    <m:r>
+                      <m:t>f</m:t>
+                    </m:r>
+                    <m:f>
+                      <m:fPr>
+                        <m:type m:val="bar"/>
+                      </m:fPr>
+                      <m:num>
+                        <m:r>
+                          <m:t>M</m:t>
+                        </m:r>
+                        <m:r>
+                          <m:t>M</m:t>
+                        </m:r>
+                        <m:r>
+                          <m:t>B</m:t>
+                        </m:r>
+                      </m:num>
+                      <m:den>
+                        <m:sSub>
+                          <m:e>
+                            <m:r>
+                              <m:t>B</m:t>
+                            </m:r>
+                          </m:e>
+                          <m:sub>
+                            <m:r>
+                              <m:t>35</m:t>
+                            </m:r>
+                          </m:sub>
+                        </m:sSub>
+                      </m:den>
+                    </m:f>
+                    <m:r>
+                      <m:rPr>
+                        <m:sty m:val="p"/>
+                      </m:rPr>
+                      <m:t>≤</m:t>
+                    </m:r>
+                    <m:r>
+                      <m:t>0.25</m:t>
+                    </m:r>
+                  </m:e>
+                </m:mr>
+                <m:mr>
+                  <m:e>
+                    <m:f>
+                      <m:fPr>
+                        <m:type m:val="bar"/>
+                      </m:fPr>
+                      <m:num>
+                        <m:sSub>
+                          <m:e>
+                            <m:r>
+                              <m:t>F</m:t>
+                            </m:r>
+                          </m:e>
+                          <m:sub>
+                            <m:r>
+                              <m:t>35</m:t>
+                            </m:r>
+                          </m:sub>
+                        </m:sSub>
+                        <m:d>
+                          <m:dPr>
+                            <m:begChr m:val="("/>
+                            <m:sepChr m:val=""/>
+                            <m:endChr m:val=")"/>
+                            <m:grow/>
+                          </m:dPr>
+                          <m:e>
+                            <m:f>
+                              <m:fPr>
+                                <m:type m:val="bar"/>
+                              </m:fPr>
+                              <m:num>
+                                <m:r>
+                                  <m:t>M</m:t>
+                                </m:r>
+                                <m:r>
+                                  <m:t>M</m:t>
+                                </m:r>
+                                <m:r>
+                                  <m:t>B</m:t>
+                                </m:r>
+                              </m:num>
+                              <m:den>
+                                <m:sSub>
+                                  <m:e>
+                                    <m:r>
+                                      <m:t>B</m:t>
+                                    </m:r>
+                                  </m:e>
+                                  <m:sub>
+                                    <m:r>
+                                      <m:t>35</m:t>
+                                    </m:r>
+                                  </m:sub>
+                                </m:sSub>
+                              </m:den>
+                            </m:f>
+                            <m:r>
+                              <m:rPr>
+                                <m:sty m:val="p"/>
+                              </m:rPr>
+                              <m:t>−</m:t>
+                            </m:r>
+                            <m:r>
+                              <m:t>α</m:t>
+                            </m:r>
+                          </m:e>
+                        </m:d>
+                      </m:num>
+                      <m:den>
+                        <m:r>
+                          <m:t>1</m:t>
+                        </m:r>
+                        <m:r>
+                          <m:rPr>
+                            <m:sty m:val="p"/>
+                          </m:rPr>
+                          <m:t>−</m:t>
+                        </m:r>
+                        <m:r>
+                          <m:t>α</m:t>
+                        </m:r>
+                      </m:den>
+                    </m:f>
+                  </m:e>
+                  <m:e>
+                    <m:r>
+                      <m:t>i</m:t>
+                    </m:r>
+                    <m:r>
+                      <m:t>f</m:t>
+                    </m:r>
+                    <m:r>
+                      <m:t>0.25</m:t>
+                    </m:r>
+                    <m:r>
+                      <m:rPr>
+                        <m:sty m:val="p"/>
+                      </m:rPr>
+                      <m:t>&lt;</m:t>
+                    </m:r>
+                    <m:f>
+                      <m:fPr>
+                        <m:type m:val="bar"/>
+                      </m:fPr>
+                      <m:num>
+                        <m:r>
+                          <m:t>M</m:t>
+                        </m:r>
+                        <m:r>
+                          <m:t>M</m:t>
+                        </m:r>
+                        <m:r>
+                          <m:t>B</m:t>
+                        </m:r>
+                      </m:num>
+                      <m:den>
+                        <m:sSub>
+                          <m:e>
+                            <m:r>
+                              <m:t>B</m:t>
+                            </m:r>
+                          </m:e>
+                          <m:sub>
+                            <m:r>
+                              <m:t>35</m:t>
+                            </m:r>
+                          </m:sub>
+                        </m:sSub>
+                      </m:den>
+                    </m:f>
+                    <m:r>
+                      <m:rPr>
+                        <m:sty m:val="p"/>
+                      </m:rPr>
+                      <m:t>&lt;</m:t>
+                    </m:r>
+                    <m:r>
+                      <m:t>1</m:t>
+                    </m:r>
+                  </m:e>
+                </m:mr>
+                <m:mr>
+                  <m:e>
+                    <m:sSub>
+                      <m:e>
+                        <m:r>
+                          <m:t>F</m:t>
+                        </m:r>
+                      </m:e>
+                      <m:sub>
+                        <m:r>
+                          <m:t>35</m:t>
+                        </m:r>
+                      </m:sub>
+                    </m:sSub>
+                  </m:e>
+                  <m:e>
+                    <m:r>
+                      <m:t>i</m:t>
+                    </m:r>
+                    <m:r>
+                      <m:t>f</m:t>
+                    </m:r>
+                    <m:r>
+                      <m:t>M</m:t>
+                    </m:r>
+                    <m:r>
+                      <m:t>M</m:t>
+                    </m:r>
+                    <m:r>
+                      <m:t>B</m:t>
+                    </m:r>
+                    <m:r>
+                      <m:rPr>
+                        <m:sty m:val="p"/>
+                      </m:rPr>
+                      <m:t>&gt;</m:t>
+                    </m:r>
+                    <m:sSub>
+                      <m:e>
+                        <m:r>
+                          <m:t>B</m:t>
+                        </m:r>
+                      </m:e>
+                      <m:sub>
+                        <m:r>
+                          <m:t>35</m:t>
+                        </m:r>
+                      </m:sub>
+                    </m:sSub>
+                  </m:e>
+                </m:mr>
+              </m:m>
+            </m:e>
+          </m:d>
+        </m:oMath>
+      </m:oMathPara>
     </w:p>
     <w:p>
       <w:pPr>
-        <w:pStyle w:val="BodyText"/>
+        <w:pStyle w:val="FirstParagraph"/>
       </w:pPr>
       <w:r>
         <w:t xml:space="preserve">Where MMB is the projected morphometrically mature male biomass in the current survey year after fishing at the F</w:t>
@@ -2278,10 +2540,7 @@
         <w:pStyle w:val="BodyText"/>
       </w:pPr>
       <w:r>
-        <w:t xml:space="preserve">Calculated Tier 3 OFLs across the 14 candidate models ranged from approximately 36 to 56 kt (</w:t>
-      </w:r>
-      <w:r>
-        <w:t xml:space="preserve">). Differences in OFLs were a result of differences in estimated MMB and the currency used for MMB; the immature-survey-index sensitivity sat at the low end of the range and the new-maturity sensitivities sat at the high end.</w:t>
+        <w:t xml:space="preserve">Calculated Tier 3 OFLs across the 14 candidate models ranged from approximately 36 to 56 kt. Differences in OFLs were a result of differences in estimated MMB and the currency used for MMB; the immature-survey-index sensitivity sat at the low end of the range and the new-maturity sensitivities sat at the high end.</w:t>
       </w:r>
     </w:p>
     <w:bookmarkEnd w:id="34"/>
@@ -2391,7 +2650,61 @@
         <w:t xml:space="preserve"> </w:t>
       </w:r>
       <w:r>
-        <w:t xml:space="preserve">Adding the index resolves the long-standing bimodality observed in jitters but produces a substantially smaller</w:t>
+        <w:t xml:space="preserve">Adding the index resolves the bimodality observed in jitters but produces a much larger mature male natural mortality. Before September the author intends to investigate whether the higher M is biologically credible (e.g., consistent with the mortality events implied by the 2018–19 marine heatwave) or whether it reflects model misspecification trying to reconcile the new index with the existing data. The author is also aprehensive to make model selection choices based on derived reference points.</w:t>
+      </w:r>
+    </w:p>
+    <w:p>
+      <w:pPr>
+        <w:numPr>
+          <w:ilvl w:val="0"/>
+          <w:numId w:val="1008"/>
+        </w:numPr>
+      </w:pPr>
+      <w:r>
+        <w:rPr>
+          <w:b/>
+          <w:bCs/>
+        </w:rPr>
+        <w:t xml:space="preserve">The new maturity workflow.</w:t>
+      </w:r>
+      <w:r>
+        <w:t xml:space="preserve"> </w:t>
+      </w:r>
+      <w:r>
+        <w:t xml:space="preserve">The Kodiak lab’s spatiotemporal</w:t>
+      </w:r>
+      <w:r>
+        <w:t xml:space="preserve"> </w:t>
+      </w:r>
+      <w:r>
+        <w:rPr>
+          <w:rStyle w:val="VerbatimChar"/>
+        </w:rPr>
+        <w:t xml:space="preserve">sdmTMB</w:t>
+      </w:r>
+      <w:r>
+        <w:t xml:space="preserve">-based workflow produces a time series with a much weaker temporal trend in the probability of terminal molt at intermediate sizes than the legacy workflow. The author has no strong basis for preferring one workflow over the other at this time and requests CPT/SSC guidance on whether to adopt the new workflow as the default input.</w:t>
+      </w:r>
+    </w:p>
+    <w:p>
+      <w:pPr>
+        <w:numPr>
+          <w:ilvl w:val="0"/>
+          <w:numId w:val="1008"/>
+        </w:numPr>
+      </w:pPr>
+      <w:r>
+        <w:rPr>
+          <w:b/>
+          <w:bCs/>
+        </w:rPr>
+        <w:t xml:space="preserve">Hybrid treatment.</w:t>
+      </w:r>
+      <w:r>
+        <w:t xml:space="preserve"> </w:t>
+      </w:r>
+      <w:r>
+        <w:t xml:space="preserve">The author presents three hybrid sensitivities (fishery only, survey only, and both) layered onto the plus-group base. Including hybrids reduces</w:t>
       </w:r>
       <w:r>
         <w:t xml:space="preserve"> </w:t>
@@ -2420,90 +2733,7 @@
         <w:t xml:space="preserve"> </w:t>
       </w:r>
       <w:r>
-        <w:t xml:space="preserve">proxy and a much larger mature male natural mortality. Before September the author intends to investigate whether the higher M is biologically credible (e.g., consistent with the mortality events implied by the 2018–19 marine heatwave) or whether it reflects model misspecification trying to reconcile the new index with the existing data.</w:t>
-      </w:r>
-    </w:p>
-    <w:p>
-      <w:pPr>
-        <w:numPr>
-          <w:ilvl w:val="0"/>
-          <w:numId w:val="1008"/>
-        </w:numPr>
-      </w:pPr>
-      <w:r>
-        <w:rPr>
-          <w:b/>
-          <w:bCs/>
-        </w:rPr>
-        <w:t xml:space="preserve">The new maturity workflow.</w:t>
-      </w:r>
-      <w:r>
-        <w:t xml:space="preserve"> </w:t>
-      </w:r>
-      <w:r>
-        <w:t xml:space="preserve">The Kodiak lab’s spatiotemporal</w:t>
-      </w:r>
-      <w:r>
-        <w:t xml:space="preserve"> </w:t>
-      </w:r>
-      <w:r>
-        <w:rPr>
-          <w:rStyle w:val="VerbatimChar"/>
-        </w:rPr>
-        <w:t xml:space="preserve">sdmTMB</w:t>
-      </w:r>
-      <w:r>
-        <w:t xml:space="preserve">-based workflow produces a time series with a much weaker temporal trend in the probability of terminal molt at intermediate sizes than the legacy workflow. The author has no strong basis for preferring one workflow over the other at this time and requests CPT/SSC guidance on whether to adopt the new workflow as the default input.</w:t>
-      </w:r>
-    </w:p>
-    <w:p>
-      <w:pPr>
-        <w:numPr>
-          <w:ilvl w:val="0"/>
-          <w:numId w:val="1008"/>
-        </w:numPr>
-      </w:pPr>
-      <w:r>
-        <w:rPr>
-          <w:b/>
-          <w:bCs/>
-        </w:rPr>
-        <w:t xml:space="preserve">Hybrid treatment.</w:t>
-      </w:r>
-      <w:r>
-        <w:t xml:space="preserve"> </w:t>
-      </w:r>
-      <w:r>
-        <w:t xml:space="preserve">The author presents three hybrid sensitivities (fishery only, survey only, and both) layered onto the plus-group base. Including hybrids reduces</w:t>
-      </w:r>
-      <w:r>
-        <w:t xml:space="preserve"> </w:t>
-      </w:r>
-      <m:oMath>
-        <m:sSub>
-          <m:e>
-            <m:r>
-              <m:t>B</m:t>
-            </m:r>
-          </m:e>
-          <m:sub>
-            <m:r>
-              <m:t>M</m:t>
-            </m:r>
-            <m:r>
-              <m:t>S</m:t>
-            </m:r>
-            <m:r>
-              <m:t>Y</m:t>
-            </m:r>
-          </m:sub>
-        </m:sSub>
-      </m:oMath>
-      <w:r>
-        <w:t xml:space="preserve"> </w:t>
-      </w:r>
-      <w:r>
-        <w:t xml:space="preserve">slightly and changes the directed OFL by a few thousand tonnes. ADF&amp;G has flagged that hybrid identification quality decreases in the older portions of the time series (notably the 1997–98 period when reported hybrid catches were very large) and that ADF&amp;G and NMFS do not currently use identical hybrid identification criteria. The author requests CPT/SSC guidance on whether hybrids should be accounted for in the assessment, and if so whether the fishery-only, survey-only, or combined treatment is preferred.</w:t>
+        <w:t xml:space="preserve">slightly and changes the directed OFL by a few thousand tonnes. ADF&amp;G has flagged that hybrid identification quality decreases in the older portions of the time series (notably the 1997–98 period when reported hybrid catches were very large) and that ADF&amp;G and NMFS do not currently use identical hybrid identification criteria. The author recommends that a snow crab only and hybrid (survey and fishery) models be adopted moving forward.</w:t>
       </w:r>
     </w:p>
     <w:p>
@@ -2511,7 +2741,7 @@
         <w:pStyle w:val="FirstParagraph"/>
       </w:pPr>
       <w:r>
-        <w:t xml:space="preserve">For September the author plans to: (a) finalize the plus-group structural change; (b) develop a Tier 4 fallback for whichever Tier 3 model is preferred; (c) complete retrospective analyses for the recommended models; (d) coordinate with ADF&amp;G on a recommended approach to the older hybrid identification data; and (e) coordinate with the Kodiak lab on documentation of the new maturity workflow that can be cited in the assessment.</w:t>
+        <w:t xml:space="preserve">For September the author plans to: (a) finalize the plus-group structural change; (b) develop a Tier 4 fallback for whichever Tier 3 model is preferred; (c) investigate the inclusion of the immature survey index; and (d) complete retrospective analyses for the recommended models.</w:t>
       </w:r>
     </w:p>
     <w:bookmarkEnd w:id="38"/>
@@ -2551,7 +2781,7 @@
         <w:t xml:space="preserve"> </w:t>
       </w:r>
       <w:r>
-        <w:t xml:space="preserve">ADF&amp;G classifies hybrid crab into three categories (opilio-type, bairdi-type, and unspecified) using a hybrid identification key based on eye color, epistome shape, and secondary morphological characteristics. ADF&amp;G and NMFS do not currently agree on the number of secondary characteristics required for a positive hybrid identification, and the unspecified-hybrid category contains a non-trivial portion of the time series. Resolving identification criteria across agencies and propagating the resulting categorization back through the historical observer time series would improve the hybrid-data products available to the assessment.</w:t>
+        <w:t xml:space="preserve">ADF&amp;G classifies hybrid crab into three categories (opilio-type, bairdi-type, and unspecified) using a hybrid identification key based on eye color, epistome shape, and secondary morphological characteristics. ADF&amp;G and NMFS do not currently agree on the number of secondary characteristics required for a positive hybrid identification, and the unspecified-hybrid category are present in a non-trivial portion of the time series. Resolving identification criteria across agencies and propagating the resulting categorization back through the historical observer time series would improve the hybrid-data products available to the assessment. However, the value add to the snow crab assessment may be minimal given the low percentage of opilio-type hybrids in the data.</w:t>
       </w:r>
     </w:p>
     <w:p>
@@ -2572,7 +2802,7 @@
         <w:t xml:space="preserve"> </w:t>
       </w:r>
       <w:r>
-        <w:t xml:space="preserve">Hybrids are currently retained under either the snow-crab or the Tanner-crab IFQ depending on regulatory identification but are not separately tracked in the retained-catch data delivered to the assessment. ADF&amp;G has indicated it does not yet have a method for partitioning historical retained catch into hybrid versus parent species. Developing such a partitioning would allow the hybrid sensitivity to be explored more fully (presently the retained time-series is identical between the hybrid and non-hybrid models because retained catch already contains hybrids).</w:t>
+        <w:t xml:space="preserve">Hybrids are currently retained under either the snow-crab or the Tanner-crab IFQ depending on regulatory identification but are not separately tracked in the retained-catch data. ADF&amp;G has indicated it does not yet have a method for partitioning historical retained catch into hybrid versus parent species. Developing such a partitioning would allow the hybrid sensitivity to be explored more fully (presently the retained time-series is identical between the hybrid and non-hybrid models because retained catch already contains hybrids).</w:t>
       </w:r>
     </w:p>
     <w:p>
@@ -2593,7 +2823,7 @@
         <w:t xml:space="preserve"> </w:t>
       </w:r>
       <w:r>
-        <w:t xml:space="preserve">The ADF&amp;G hybrid total-catch estimates contain unexpectedly large values in 1997 (~18 kt of legal-male hybrid catch) and 1998 (~15 kt), with high-CPUE pots peppered around the fishery footprint rather than concentrated in obvious hot spots. ADF&amp;G has flagged these years as requiring follow-up before the data should be considered reliable for assessment use.</w:t>
+        <w:t xml:space="preserve">The ADF&amp;G hybrid total-catch estimates contain unexpectedly large values in 1997 (~18 kt of legal-male hybrid catch) and 1998 (~15 kt), with high-CPUE pots peppered around the fishery footprint rather than concentrated in obvious hot spots. ADF&amp;G has flagged these years as requiring follow-up before the data should be considered reliable for regular assessment use.</w:t>
       </w:r>
     </w:p>
     <w:p>
@@ -2614,7 +2844,7 @@
         <w:t xml:space="preserve"> </w:t>
       </w:r>
       <w:r>
-        <w:t xml:space="preserve">The new spatiotemporal maturity workflow produces a much weaker temporal trend in the probability of terminal molt at size than the legacy workflow. Side-by-side documentation of the two workflows, an evaluation of the spatial sample sizes of chela measurements (which are sparse at many stations and many sizes), and quantification of the degrees of freedom consumed by the spatial process would help the CPT and SSC evaluate the two approaches.</w:t>
+        <w:t xml:space="preserve">The new spatiotemporal maturity workflow produces a much weaker temporal trend in the probability of terminal molt at size than the legacy workflow. Side-by-side documentation of the two workflows, an evaluation of the spatial sample sizes of chela measurements (which are sparse at many stations and many sizes), uncertainty, and quantification of the degrees of freedom consumed by the spatial process would help the CPT and SSC evaluate the two approaches.</w:t>
       </w:r>
     </w:p>
     <w:p>
@@ -2670,7 +2900,7 @@
         <w:t xml:space="preserve"> </w:t>
       </w:r>
       <w:r>
-        <w:t xml:space="preserve">As noted in 2024 and 2025 SSC comments, more research is needed on whether small males can and do mate with large females and produce progeny that will be large males under favorable environmental conditions. This question remains the central scientific uncertainty constraining management because the fishery cannot exist without large males and large males are at historical lows.</w:t>
+        <w:t xml:space="preserve">As noted in 2024 and 2025 SSC comments, more research is needed on whether small males can and do mate with large females and produce progeny that will be large males under favorable environmental conditions. This question remains the main axis of uncertainty because the fishery cannot exist without large males and large males are at historical lows.</w:t>
       </w:r>
     </w:p>
     <w:bookmarkEnd w:id="40"/>
@@ -3216,21 +3446,21 @@
         <w:tblCaption w:val="Likelihood components by category and model."/>
       </w:tblPr>
       <w:tblGrid>
-        <w:gridCol w:w="374"/>
-        <w:gridCol w:w="171"/>
-        <w:gridCol w:w="312"/>
-        <w:gridCol w:w="640"/>
-        <w:gridCol w:w="687"/>
-        <w:gridCol w:w="468"/>
-        <w:gridCol w:w="515"/>
-        <w:gridCol w:w="671"/>
-        <w:gridCol w:w="843"/>
-        <w:gridCol w:w="484"/>
-        <w:gridCol w:w="531"/>
-        <w:gridCol w:w="484"/>
-        <w:gridCol w:w="468"/>
-        <w:gridCol w:w="624"/>
-        <w:gridCol w:w="640"/>
+        <w:gridCol w:w="1145"/>
+        <w:gridCol w:w="477"/>
+        <w:gridCol w:w="477"/>
+        <w:gridCol w:w="477"/>
+        <w:gridCol w:w="477"/>
+        <w:gridCol w:w="477"/>
+        <w:gridCol w:w="477"/>
+        <w:gridCol w:w="477"/>
+        <w:gridCol w:w="572"/>
+        <w:gridCol w:w="477"/>
+        <w:gridCol w:w="477"/>
+        <w:gridCol w:w="477"/>
+        <w:gridCol w:w="477"/>
+        <w:gridCol w:w="477"/>
+        <w:gridCol w:w="477"/>
       </w:tblGrid>
       <w:tr>
         <w:trPr>
@@ -3252,7 +3482,7 @@
               <w:jc w:val="right"/>
             </w:pPr>
             <w:r>
-              <w:t xml:space="preserve">25.1 gmacs</w:t>
+              <w:t xml:space="preserve">25.1</w:t>
             </w:r>
           </w:p>
         </w:tc>
@@ -3264,7 +3494,7 @@
               <w:jc w:val="right"/>
             </w:pPr>
             <w:r>
-              <w:t xml:space="preserve">25.1 gmacs (update)</w:t>
+              <w:t xml:space="preserve">u</w:t>
             </w:r>
           </w:p>
         </w:tc>
@@ -3276,7 +3506,7 @@
               <w:jc w:val="right"/>
             </w:pPr>
             <w:r>
-              <w:t xml:space="preserve">25.1 gmacs (update + imm_surv + compfix)</w:t>
+              <w:t xml:space="preserve">u+imm+cf</w:t>
             </w:r>
           </w:p>
         </w:tc>
@@ -3288,7 +3518,7 @@
               <w:jc w:val="right"/>
             </w:pPr>
             <w:r>
-              <w:t xml:space="preserve">25.1 gmacs (update + imm_surv + plus group)</w:t>
+              <w:t xml:space="preserve">u+imm+pg</w:t>
             </w:r>
           </w:p>
         </w:tc>
@@ -3300,7 +3530,7 @@
               <w:jc w:val="right"/>
             </w:pPr>
             <w:r>
-              <w:t xml:space="preserve">25.1 gmacs (update + compfix)</w:t>
+              <w:t xml:space="preserve">u+cf</w:t>
             </w:r>
           </w:p>
         </w:tc>
@@ -3312,7 +3542,7 @@
               <w:jc w:val="right"/>
             </w:pPr>
             <w:r>
-              <w:t xml:space="preserve">25.1 gmacs (update + plus group)</w:t>
+              <w:t xml:space="preserve">u+pg</w:t>
             </w:r>
           </w:p>
         </w:tc>
@@ -3324,7 +3554,7 @@
               <w:jc w:val="right"/>
             </w:pPr>
             <w:r>
-              <w:t xml:space="preserve">25.1 gmacs (update + new_mat + plus group)</w:t>
+              <w:t xml:space="preserve">u+nm+pg</w:t>
             </w:r>
           </w:p>
         </w:tc>
@@ -3336,7 +3566,7 @@
               <w:jc w:val="right"/>
             </w:pPr>
             <w:r>
-              <w:t xml:space="preserve">25.1 gmacs (update + new_mat + imm_surv + plus group)</w:t>
+              <w:t xml:space="preserve">u+nm+imm+pg</w:t>
             </w:r>
           </w:p>
         </w:tc>
@@ -3348,7 +3578,7 @@
               <w:jc w:val="right"/>
             </w:pPr>
             <w:r>
-              <w:t xml:space="preserve">25.1 gmacs (update + hyb_surv)</w:t>
+              <w:t xml:space="preserve">u+hs</w:t>
             </w:r>
           </w:p>
         </w:tc>
@@ -3360,7 +3590,7 @@
               <w:jc w:val="right"/>
             </w:pPr>
             <w:r>
-              <w:t xml:space="preserve">25.1 gmacs (update + hyb_fishery)</w:t>
+              <w:t xml:space="preserve">u+hf</w:t>
             </w:r>
           </w:p>
         </w:tc>
@@ -3372,7 +3602,7 @@
               <w:jc w:val="right"/>
             </w:pPr>
             <w:r>
-              <w:t xml:space="preserve">25.1 gmacs (update + hyb_both)</w:t>
+              <w:t xml:space="preserve">u+hb</w:t>
             </w:r>
           </w:p>
         </w:tc>
@@ -3384,7 +3614,7 @@
               <w:jc w:val="right"/>
             </w:pPr>
             <w:r>
-              <w:t xml:space="preserve">25.1 gmacs (update + new_mat)</w:t>
+              <w:t xml:space="preserve">u+nm</w:t>
             </w:r>
           </w:p>
         </w:tc>
@@ -3396,7 +3626,7 @@
               <w:jc w:val="right"/>
             </w:pPr>
             <w:r>
-              <w:t xml:space="preserve">25.1 gmacs (update + new_mat + compfix)</w:t>
+              <w:t xml:space="preserve">u+nm+cf</w:t>
             </w:r>
           </w:p>
         </w:tc>
@@ -3408,7 +3638,7 @@
               <w:jc w:val="right"/>
             </w:pPr>
             <w:r>
-              <w:t xml:space="preserve">25.1 gmacs (update + hyb_both + new_mat)</w:t>
+              <w:t xml:space="preserve">u+hb+nm</w:t>
             </w:r>
           </w:p>
         </w:tc>
@@ -3590,7 +3820,7 @@
               <w:jc w:val="right"/>
             </w:pPr>
             <w:r>
-              <w:t xml:space="preserve">947.42</w:t>
+              <w:t xml:space="preserve">948.57</w:t>
             </w:r>
           </w:p>
         </w:tc>
@@ -3772,7 +4002,7 @@
               <w:jc w:val="right"/>
             </w:pPr>
             <w:r>
-              <w:t xml:space="preserve">162.84</w:t>
+              <w:t xml:space="preserve">158.77</w:t>
             </w:r>
           </w:p>
         </w:tc>
@@ -3954,7 +4184,7 @@
               <w:jc w:val="right"/>
             </w:pPr>
             <w:r>
-              <w:t xml:space="preserve">-28972.04</w:t>
+              <w:t xml:space="preserve">-29037.24</w:t>
             </w:r>
           </w:p>
         </w:tc>
@@ -4136,7 +4366,7 @@
               <w:jc w:val="right"/>
             </w:pPr>
             <w:r>
-              <w:t xml:space="preserve">179.79</w:t>
+              <w:t xml:space="preserve">184.50</w:t>
             </w:r>
           </w:p>
         </w:tc>
@@ -4500,7 +4730,7 @@
               <w:jc w:val="right"/>
             </w:pPr>
             <w:r>
-              <w:t xml:space="preserve">749.51</w:t>
+              <w:t xml:space="preserve">753.74</w:t>
             </w:r>
           </w:p>
         </w:tc>
@@ -4682,7 +4912,7 @@
               <w:jc w:val="right"/>
             </w:pPr>
             <w:r>
-              <w:t xml:space="preserve">388.85</w:t>
+              <w:t xml:space="preserve">383.36</w:t>
             </w:r>
           </w:p>
         </w:tc>
@@ -5046,7 +5276,7 @@
               <w:jc w:val="right"/>
             </w:pPr>
             <w:r>
-              <w:t xml:space="preserve">7966.84</w:t>
+              <w:t xml:space="preserve">7966.31</w:t>
             </w:r>
           </w:p>
         </w:tc>
@@ -5410,7 +5640,7 @@
               <w:jc w:val="right"/>
             </w:pPr>
             <w:r>
-              <w:t xml:space="preserve">-18576.79</w:t>
+              <w:t xml:space="preserve">-18642.00</w:t>
             </w:r>
           </w:p>
         </w:tc>
@@ -9306,18 +9536,17 @@
     <w:tbl>
       <w:tblPr>
         <w:tblStyle w:val="Table"/>
-        <w:tblW w:type="pct" w:w="5000"/>
-        <w:tblLayout w:type="fixed"/>
+        <w:tblW w:type="auto" w:w="0"/>
         <w:tblLook w:firstRow="1" w:lastRow="0" w:firstColumn="0" w:lastColumn="0" w:noHBand="0" w:noVBand="0" w:val="0020"/>
         <w:tblCaption w:val="Management quantities derived from maximum likelihood estimates by model using Tier 3 reference points. Reported natural mortality is for mature males, average recruitment is for males, and status and MMB were estimates for February 15 of the completed crab year."/>
       </w:tblPr>
       <w:tblGrid>
-        <w:gridCol w:w="4648"/>
-        <w:gridCol w:w="602"/>
-        <w:gridCol w:w="946"/>
-        <w:gridCol w:w="602"/>
-        <w:gridCol w:w="602"/>
-        <w:gridCol w:w="516"/>
+        <w:gridCol w:w="1320"/>
+        <w:gridCol w:w="1320"/>
+        <w:gridCol w:w="1320"/>
+        <w:gridCol w:w="1320"/>
+        <w:gridCol w:w="1320"/>
+        <w:gridCol w:w="1320"/>
       </w:tblGrid>
       <w:tr>
         <w:trPr>
@@ -9405,7 +9634,7 @@
               <w:jc w:val="left"/>
             </w:pPr>
             <w:r>
-              <w:t xml:space="preserve">25.1 gmacs</w:t>
+              <w:t xml:space="preserve">25.1</w:t>
             </w:r>
           </w:p>
         </w:tc>
@@ -9479,7 +9708,7 @@
               <w:jc w:val="left"/>
             </w:pPr>
             <w:r>
-              <w:t xml:space="preserve">25.1 gmacs (update)</w:t>
+              <w:t xml:space="preserve">u</w:t>
             </w:r>
           </w:p>
         </w:tc>
@@ -9553,7 +9782,7 @@
               <w:jc w:val="left"/>
             </w:pPr>
             <w:r>
-              <w:t xml:space="preserve">25.1 gmacs (update + imm_surv + compfix)</w:t>
+              <w:t xml:space="preserve">u+imm+cf</w:t>
             </w:r>
           </w:p>
         </w:tc>
@@ -9627,7 +9856,7 @@
               <w:jc w:val="left"/>
             </w:pPr>
             <w:r>
-              <w:t xml:space="preserve">25.1 gmacs (update + imm_surv + plus group)</w:t>
+              <w:t xml:space="preserve">u+imm+pg</w:t>
             </w:r>
           </w:p>
         </w:tc>
@@ -9701,7 +9930,7 @@
               <w:jc w:val="left"/>
             </w:pPr>
             <w:r>
-              <w:t xml:space="preserve">25.1 gmacs (update + compfix)</w:t>
+              <w:t xml:space="preserve">u+cf</w:t>
             </w:r>
           </w:p>
         </w:tc>
@@ -9775,7 +10004,7 @@
               <w:jc w:val="left"/>
             </w:pPr>
             <w:r>
-              <w:t xml:space="preserve">25.1 gmacs (update + plus group)</w:t>
+              <w:t xml:space="preserve">u+pg</w:t>
             </w:r>
           </w:p>
         </w:tc>
@@ -9849,7 +10078,7 @@
               <w:jc w:val="left"/>
             </w:pPr>
             <w:r>
-              <w:t xml:space="preserve">25.1 gmacs (update + new_mat + plus group)</w:t>
+              <w:t xml:space="preserve">u+nm+pg</w:t>
             </w:r>
           </w:p>
         </w:tc>
@@ -9923,7 +10152,7 @@
               <w:jc w:val="left"/>
             </w:pPr>
             <w:r>
-              <w:t xml:space="preserve">25.1 gmacs (update + new_mat + imm_surv + plus group)</w:t>
+              <w:t xml:space="preserve">u+nm+imm+pg</w:t>
             </w:r>
           </w:p>
         </w:tc>
@@ -9997,7 +10226,7 @@
               <w:jc w:val="left"/>
             </w:pPr>
             <w:r>
-              <w:t xml:space="preserve">25.1 gmacs (update + hyb_surv)</w:t>
+              <w:t xml:space="preserve">u+hs</w:t>
             </w:r>
           </w:p>
         </w:tc>
@@ -10071,7 +10300,7 @@
               <w:jc w:val="left"/>
             </w:pPr>
             <w:r>
-              <w:t xml:space="preserve">25.1 gmacs (update + hyb_fishery)</w:t>
+              <w:t xml:space="preserve">u+hf</w:t>
             </w:r>
           </w:p>
         </w:tc>
@@ -10145,7 +10374,7 @@
               <w:jc w:val="left"/>
             </w:pPr>
             <w:r>
-              <w:t xml:space="preserve">25.1 gmacs (update + hyb_both)</w:t>
+              <w:t xml:space="preserve">u+hb</w:t>
             </w:r>
           </w:p>
         </w:tc>
@@ -10219,7 +10448,7 @@
               <w:jc w:val="left"/>
             </w:pPr>
             <w:r>
-              <w:t xml:space="preserve">25.1 gmacs (update + new_mat)</w:t>
+              <w:t xml:space="preserve">u+nm</w:t>
             </w:r>
           </w:p>
         </w:tc>
@@ -10293,7 +10522,7 @@
               <w:jc w:val="left"/>
             </w:pPr>
             <w:r>
-              <w:t xml:space="preserve">25.1 gmacs (update + new_mat + compfix)</w:t>
+              <w:t xml:space="preserve">u+nm+cf</w:t>
             </w:r>
           </w:p>
         </w:tc>
@@ -10367,7 +10596,7 @@
               <w:jc w:val="left"/>
             </w:pPr>
             <w:r>
-              <w:t xml:space="preserve">25.1 gmacs (update + hyb_both + new_mat)</w:t>
+              <w:t xml:space="preserve">u+hb+nm</w:t>
             </w:r>
           </w:p>
         </w:tc>
@@ -10379,7 +10608,7 @@
               <w:jc w:val="right"/>
             </w:pPr>
             <w:r>
-              <w:t xml:space="preserve">160.35</w:t>
+              <w:t xml:space="preserve">169.75</w:t>
             </w:r>
           </w:p>
         </w:tc>
@@ -10391,7 +10620,7 @@
               <w:jc w:val="right"/>
             </w:pPr>
             <w:r>
-              <w:t xml:space="preserve">1.02</w:t>
+              <w:t xml:space="preserve">1.01</w:t>
             </w:r>
           </w:p>
         </w:tc>
@@ -10403,7 +10632,7 @@
               <w:jc w:val="right"/>
             </w:pPr>
             <w:r>
-              <w:t xml:space="preserve">43.28</w:t>
+              <w:t xml:space="preserve">44.15</w:t>
             </w:r>
           </w:p>
         </w:tc>
@@ -10415,7 +10644,7 @@
               <w:jc w:val="right"/>
             </w:pPr>
             <w:r>
-              <w:t xml:space="preserve">43.28</w:t>
+              <w:t xml:space="preserve">44.15</w:t>
             </w:r>
           </w:p>
         </w:tc>
@@ -10427,13 +10656,17 @@
               <w:jc w:val="right"/>
             </w:pPr>
             <w:r>
-              <w:t xml:space="preserve">55.74</w:t>
+              <w:t xml:space="preserve">49.57</w:t>
             </w:r>
           </w:p>
         </w:tc>
       </w:tr>
     </w:tbl>
-    <w:p/>
+    <w:p>
+      <w:r>
+        <w:br w:type="page"/>
+      </w:r>
+    </w:p>
     <w:p>
       <w:pPr>
         <w:pStyle w:val="TableCaption"/>
@@ -18455,13 +18688,13 @@
     <w:tbl>
       <w:tblPr>
         <w:tblStyle w:val="Table"/>
-        <w:tblW w:type="pct" w:w="3819"/>
+        <w:tblW w:type="pct" w:w="3472"/>
         <w:tblLayout w:type="fixed"/>
         <w:tblLook w:firstRow="1" w:lastRow="0" w:firstColumn="0" w:lastColumn="0" w:noHBand="0" w:noVBand="0" w:val="0020"/>
         <w:tblCaption w:val=" Comparison of mature male biomass (MMB) at mating, male recruitment (billions), and fully-selected fishing mortality (F) across selected models."/>
       </w:tblPr>
       <w:tblGrid>
-        <w:gridCol w:w="1430"/>
+        <w:gridCol w:w="880"/>
         <w:gridCol w:w="990"/>
         <w:gridCol w:w="1100"/>
         <w:gridCol w:w="1210"/>
@@ -18571,19 +18804,7 @@
               <w:jc w:val="left"/>
             </w:pPr>
             <w:r>
-              <w:t xml:space="preserve">25.1 gmacs</w:t>
-            </w:r>
-            <w:r>
-              <w:t xml:space="preserve"> </w:t>
-            </w:r>
-            <w:r>
-              <w:t xml:space="preserve">(update +</w:t>
-            </w:r>
-            <w:r>
-              <w:t xml:space="preserve"> </w:t>
-            </w:r>
-            <w:r>
-              <w:t xml:space="preserve">hyb_both)</w:t>
+              <w:t xml:space="preserve">u+hb</w:t>
             </w:r>
           </w:p>
         </w:tc>
@@ -18645,19 +18866,7 @@
               <w:jc w:val="left"/>
             </w:pPr>
             <w:r>
-              <w:t xml:space="preserve">25.1 gmacs</w:t>
-            </w:r>
-            <w:r>
-              <w:t xml:space="preserve"> </w:t>
-            </w:r>
-            <w:r>
-              <w:t xml:space="preserve">(update +</w:t>
-            </w:r>
-            <w:r>
-              <w:t xml:space="preserve"> </w:t>
-            </w:r>
-            <w:r>
-              <w:t xml:space="preserve">hyb_both)</w:t>
+              <w:t xml:space="preserve">u+hb</w:t>
             </w:r>
           </w:p>
         </w:tc>
@@ -18719,19 +18928,7 @@
               <w:jc w:val="left"/>
             </w:pPr>
             <w:r>
-              <w:t xml:space="preserve">25.1 gmacs</w:t>
-            </w:r>
-            <w:r>
-              <w:t xml:space="preserve"> </w:t>
-            </w:r>
-            <w:r>
-              <w:t xml:space="preserve">(update +</w:t>
-            </w:r>
-            <w:r>
-              <w:t xml:space="preserve"> </w:t>
-            </w:r>
-            <w:r>
-              <w:t xml:space="preserve">hyb_both)</w:t>
+              <w:t xml:space="preserve">u+hb</w:t>
             </w:r>
           </w:p>
         </w:tc>
@@ -18793,19 +18990,7 @@
               <w:jc w:val="left"/>
             </w:pPr>
             <w:r>
-              <w:t xml:space="preserve">25.1 gmacs</w:t>
-            </w:r>
-            <w:r>
-              <w:t xml:space="preserve"> </w:t>
-            </w:r>
-            <w:r>
-              <w:t xml:space="preserve">(update +</w:t>
-            </w:r>
-            <w:r>
-              <w:t xml:space="preserve"> </w:t>
-            </w:r>
-            <w:r>
-              <w:t xml:space="preserve">hyb_both)</w:t>
+              <w:t xml:space="preserve">u+hb</w:t>
             </w:r>
           </w:p>
         </w:tc>
@@ -18867,19 +19052,7 @@
               <w:jc w:val="left"/>
             </w:pPr>
             <w:r>
-              <w:t xml:space="preserve">25.1 gmacs</w:t>
-            </w:r>
-            <w:r>
-              <w:t xml:space="preserve"> </w:t>
-            </w:r>
-            <w:r>
-              <w:t xml:space="preserve">(update +</w:t>
-            </w:r>
-            <w:r>
-              <w:t xml:space="preserve"> </w:t>
-            </w:r>
-            <w:r>
-              <w:t xml:space="preserve">hyb_both)</w:t>
+              <w:t xml:space="preserve">u+hb</w:t>
             </w:r>
           </w:p>
         </w:tc>
@@ -18941,19 +19114,7 @@
               <w:jc w:val="left"/>
             </w:pPr>
             <w:r>
-              <w:t xml:space="preserve">25.1 gmacs</w:t>
-            </w:r>
-            <w:r>
-              <w:t xml:space="preserve"> </w:t>
-            </w:r>
-            <w:r>
-              <w:t xml:space="preserve">(update +</w:t>
-            </w:r>
-            <w:r>
-              <w:t xml:space="preserve"> </w:t>
-            </w:r>
-            <w:r>
-              <w:t xml:space="preserve">hyb_both)</w:t>
+              <w:t xml:space="preserve">u+hb</w:t>
             </w:r>
           </w:p>
         </w:tc>
@@ -19015,19 +19176,7 @@
               <w:jc w:val="left"/>
             </w:pPr>
             <w:r>
-              <w:t xml:space="preserve">25.1 gmacs</w:t>
-            </w:r>
-            <w:r>
-              <w:t xml:space="preserve"> </w:t>
-            </w:r>
-            <w:r>
-              <w:t xml:space="preserve">(update +</w:t>
-            </w:r>
-            <w:r>
-              <w:t xml:space="preserve"> </w:t>
-            </w:r>
-            <w:r>
-              <w:t xml:space="preserve">hyb_both)</w:t>
+              <w:t xml:space="preserve">u+hb</w:t>
             </w:r>
           </w:p>
         </w:tc>
@@ -19089,19 +19238,7 @@
               <w:jc w:val="left"/>
             </w:pPr>
             <w:r>
-              <w:t xml:space="preserve">25.1 gmacs</w:t>
-            </w:r>
-            <w:r>
-              <w:t xml:space="preserve"> </w:t>
-            </w:r>
-            <w:r>
-              <w:t xml:space="preserve">(update +</w:t>
-            </w:r>
-            <w:r>
-              <w:t xml:space="preserve"> </w:t>
-            </w:r>
-            <w:r>
-              <w:t xml:space="preserve">hyb_both)</w:t>
+              <w:t xml:space="preserve">u+hb</w:t>
             </w:r>
           </w:p>
         </w:tc>
@@ -19163,19 +19300,7 @@
               <w:jc w:val="left"/>
             </w:pPr>
             <w:r>
-              <w:t xml:space="preserve">25.1 gmacs</w:t>
-            </w:r>
-            <w:r>
-              <w:t xml:space="preserve"> </w:t>
-            </w:r>
-            <w:r>
-              <w:t xml:space="preserve">(update +</w:t>
-            </w:r>
-            <w:r>
-              <w:t xml:space="preserve"> </w:t>
-            </w:r>
-            <w:r>
-              <w:t xml:space="preserve">hyb_both)</w:t>
+              <w:t xml:space="preserve">u+hb</w:t>
             </w:r>
           </w:p>
         </w:tc>
@@ -19237,19 +19362,7 @@
               <w:jc w:val="left"/>
             </w:pPr>
             <w:r>
-              <w:t xml:space="preserve">25.1 gmacs</w:t>
-            </w:r>
-            <w:r>
-              <w:t xml:space="preserve"> </w:t>
-            </w:r>
-            <w:r>
-              <w:t xml:space="preserve">(update +</w:t>
-            </w:r>
-            <w:r>
-              <w:t xml:space="preserve"> </w:t>
-            </w:r>
-            <w:r>
-              <w:t xml:space="preserve">hyb_both)</w:t>
+              <w:t xml:space="preserve">u+hb</w:t>
             </w:r>
           </w:p>
         </w:tc>
@@ -19311,19 +19424,7 @@
               <w:jc w:val="left"/>
             </w:pPr>
             <w:r>
-              <w:t xml:space="preserve">25.1 gmacs</w:t>
-            </w:r>
-            <w:r>
-              <w:t xml:space="preserve"> </w:t>
-            </w:r>
-            <w:r>
-              <w:t xml:space="preserve">(update +</w:t>
-            </w:r>
-            <w:r>
-              <w:t xml:space="preserve"> </w:t>
-            </w:r>
-            <w:r>
-              <w:t xml:space="preserve">hyb_both)</w:t>
+              <w:t xml:space="preserve">u+hb</w:t>
             </w:r>
           </w:p>
         </w:tc>
@@ -19385,19 +19486,7 @@
               <w:jc w:val="left"/>
             </w:pPr>
             <w:r>
-              <w:t xml:space="preserve">25.1 gmacs</w:t>
-            </w:r>
-            <w:r>
-              <w:t xml:space="preserve"> </w:t>
-            </w:r>
-            <w:r>
-              <w:t xml:space="preserve">(update +</w:t>
-            </w:r>
-            <w:r>
-              <w:t xml:space="preserve"> </w:t>
-            </w:r>
-            <w:r>
-              <w:t xml:space="preserve">hyb_both)</w:t>
+              <w:t xml:space="preserve">u+hb</w:t>
             </w:r>
           </w:p>
         </w:tc>
@@ -19459,19 +19548,7 @@
               <w:jc w:val="left"/>
             </w:pPr>
             <w:r>
-              <w:t xml:space="preserve">25.1 gmacs</w:t>
-            </w:r>
-            <w:r>
-              <w:t xml:space="preserve"> </w:t>
-            </w:r>
-            <w:r>
-              <w:t xml:space="preserve">(update +</w:t>
-            </w:r>
-            <w:r>
-              <w:t xml:space="preserve"> </w:t>
-            </w:r>
-            <w:r>
-              <w:t xml:space="preserve">hyb_both)</w:t>
+              <w:t xml:space="preserve">u+hb</w:t>
             </w:r>
           </w:p>
         </w:tc>
@@ -19533,19 +19610,7 @@
               <w:jc w:val="left"/>
             </w:pPr>
             <w:r>
-              <w:t xml:space="preserve">25.1 gmacs</w:t>
-            </w:r>
-            <w:r>
-              <w:t xml:space="preserve"> </w:t>
-            </w:r>
-            <w:r>
-              <w:t xml:space="preserve">(update +</w:t>
-            </w:r>
-            <w:r>
-              <w:t xml:space="preserve"> </w:t>
-            </w:r>
-            <w:r>
-              <w:t xml:space="preserve">hyb_both)</w:t>
+              <w:t xml:space="preserve">u+hb</w:t>
             </w:r>
           </w:p>
         </w:tc>
@@ -19607,19 +19672,7 @@
               <w:jc w:val="left"/>
             </w:pPr>
             <w:r>
-              <w:t xml:space="preserve">25.1 gmacs</w:t>
-            </w:r>
-            <w:r>
-              <w:t xml:space="preserve"> </w:t>
-            </w:r>
-            <w:r>
-              <w:t xml:space="preserve">(update +</w:t>
-            </w:r>
-            <w:r>
-              <w:t xml:space="preserve"> </w:t>
-            </w:r>
-            <w:r>
-              <w:t xml:space="preserve">hyb_both)</w:t>
+              <w:t xml:space="preserve">u+hb</w:t>
             </w:r>
           </w:p>
         </w:tc>
@@ -19681,19 +19734,7 @@
               <w:jc w:val="left"/>
             </w:pPr>
             <w:r>
-              <w:t xml:space="preserve">25.1 gmacs</w:t>
-            </w:r>
-            <w:r>
-              <w:t xml:space="preserve"> </w:t>
-            </w:r>
-            <w:r>
-              <w:t xml:space="preserve">(update +</w:t>
-            </w:r>
-            <w:r>
-              <w:t xml:space="preserve"> </w:t>
-            </w:r>
-            <w:r>
-              <w:t xml:space="preserve">hyb_both)</w:t>
+              <w:t xml:space="preserve">u+hb</w:t>
             </w:r>
           </w:p>
         </w:tc>
@@ -19755,19 +19796,7 @@
               <w:jc w:val="left"/>
             </w:pPr>
             <w:r>
-              <w:t xml:space="preserve">25.1 gmacs</w:t>
-            </w:r>
-            <w:r>
-              <w:t xml:space="preserve"> </w:t>
-            </w:r>
-            <w:r>
-              <w:t xml:space="preserve">(update +</w:t>
-            </w:r>
-            <w:r>
-              <w:t xml:space="preserve"> </w:t>
-            </w:r>
-            <w:r>
-              <w:t xml:space="preserve">hyb_both)</w:t>
+              <w:t xml:space="preserve">u+hb</w:t>
             </w:r>
           </w:p>
         </w:tc>
@@ -19829,19 +19858,7 @@
               <w:jc w:val="left"/>
             </w:pPr>
             <w:r>
-              <w:t xml:space="preserve">25.1 gmacs</w:t>
-            </w:r>
-            <w:r>
-              <w:t xml:space="preserve"> </w:t>
-            </w:r>
-            <w:r>
-              <w:t xml:space="preserve">(update +</w:t>
-            </w:r>
-            <w:r>
-              <w:t xml:space="preserve"> </w:t>
-            </w:r>
-            <w:r>
-              <w:t xml:space="preserve">hyb_both)</w:t>
+              <w:t xml:space="preserve">u+hb</w:t>
             </w:r>
           </w:p>
         </w:tc>
@@ -19903,19 +19920,7 @@
               <w:jc w:val="left"/>
             </w:pPr>
             <w:r>
-              <w:t xml:space="preserve">25.1 gmacs</w:t>
-            </w:r>
-            <w:r>
-              <w:t xml:space="preserve"> </w:t>
-            </w:r>
-            <w:r>
-              <w:t xml:space="preserve">(update +</w:t>
-            </w:r>
-            <w:r>
-              <w:t xml:space="preserve"> </w:t>
-            </w:r>
-            <w:r>
-              <w:t xml:space="preserve">hyb_both)</w:t>
+              <w:t xml:space="preserve">u+hb</w:t>
             </w:r>
           </w:p>
         </w:tc>
@@ -19977,19 +19982,7 @@
               <w:jc w:val="left"/>
             </w:pPr>
             <w:r>
-              <w:t xml:space="preserve">25.1 gmacs</w:t>
-            </w:r>
-            <w:r>
-              <w:t xml:space="preserve"> </w:t>
-            </w:r>
-            <w:r>
-              <w:t xml:space="preserve">(update +</w:t>
-            </w:r>
-            <w:r>
-              <w:t xml:space="preserve"> </w:t>
-            </w:r>
-            <w:r>
-              <w:t xml:space="preserve">hyb_both)</w:t>
+              <w:t xml:space="preserve">u+hb</w:t>
             </w:r>
           </w:p>
         </w:tc>
@@ -20051,19 +20044,7 @@
               <w:jc w:val="left"/>
             </w:pPr>
             <w:r>
-              <w:t xml:space="preserve">25.1 gmacs</w:t>
-            </w:r>
-            <w:r>
-              <w:t xml:space="preserve"> </w:t>
-            </w:r>
-            <w:r>
-              <w:t xml:space="preserve">(update +</w:t>
-            </w:r>
-            <w:r>
-              <w:t xml:space="preserve"> </w:t>
-            </w:r>
-            <w:r>
-              <w:t xml:space="preserve">hyb_both)</w:t>
+              <w:t xml:space="preserve">u+hb</w:t>
             </w:r>
           </w:p>
         </w:tc>
@@ -20125,19 +20106,7 @@
               <w:jc w:val="left"/>
             </w:pPr>
             <w:r>
-              <w:t xml:space="preserve">25.1 gmacs</w:t>
-            </w:r>
-            <w:r>
-              <w:t xml:space="preserve"> </w:t>
-            </w:r>
-            <w:r>
-              <w:t xml:space="preserve">(update +</w:t>
-            </w:r>
-            <w:r>
-              <w:t xml:space="preserve"> </w:t>
-            </w:r>
-            <w:r>
-              <w:t xml:space="preserve">hyb_both)</w:t>
+              <w:t xml:space="preserve">u+hb</w:t>
             </w:r>
           </w:p>
         </w:tc>
@@ -20199,19 +20168,7 @@
               <w:jc w:val="left"/>
             </w:pPr>
             <w:r>
-              <w:t xml:space="preserve">25.1 gmacs</w:t>
-            </w:r>
-            <w:r>
-              <w:t xml:space="preserve"> </w:t>
-            </w:r>
-            <w:r>
-              <w:t xml:space="preserve">(update +</w:t>
-            </w:r>
-            <w:r>
-              <w:t xml:space="preserve"> </w:t>
-            </w:r>
-            <w:r>
-              <w:t xml:space="preserve">hyb_both)</w:t>
+              <w:t xml:space="preserve">u+hb</w:t>
             </w:r>
           </w:p>
         </w:tc>
@@ -20273,19 +20230,7 @@
               <w:jc w:val="left"/>
             </w:pPr>
             <w:r>
-              <w:t xml:space="preserve">25.1 gmacs</w:t>
-            </w:r>
-            <w:r>
-              <w:t xml:space="preserve"> </w:t>
-            </w:r>
-            <w:r>
-              <w:t xml:space="preserve">(update +</w:t>
-            </w:r>
-            <w:r>
-              <w:t xml:space="preserve"> </w:t>
-            </w:r>
-            <w:r>
-              <w:t xml:space="preserve">hyb_both)</w:t>
+              <w:t xml:space="preserve">u+hb</w:t>
             </w:r>
           </w:p>
         </w:tc>
@@ -20347,19 +20292,7 @@
               <w:jc w:val="left"/>
             </w:pPr>
             <w:r>
-              <w:t xml:space="preserve">25.1 gmacs</w:t>
-            </w:r>
-            <w:r>
-              <w:t xml:space="preserve"> </w:t>
-            </w:r>
-            <w:r>
-              <w:t xml:space="preserve">(update +</w:t>
-            </w:r>
-            <w:r>
-              <w:t xml:space="preserve"> </w:t>
-            </w:r>
-            <w:r>
-              <w:t xml:space="preserve">hyb_both)</w:t>
+              <w:t xml:space="preserve">u+hb</w:t>
             </w:r>
           </w:p>
         </w:tc>
@@ -20421,19 +20354,7 @@
               <w:jc w:val="left"/>
             </w:pPr>
             <w:r>
-              <w:t xml:space="preserve">25.1 gmacs</w:t>
-            </w:r>
-            <w:r>
-              <w:t xml:space="preserve"> </w:t>
-            </w:r>
-            <w:r>
-              <w:t xml:space="preserve">(update +</w:t>
-            </w:r>
-            <w:r>
-              <w:t xml:space="preserve"> </w:t>
-            </w:r>
-            <w:r>
-              <w:t xml:space="preserve">hyb_both)</w:t>
+              <w:t xml:space="preserve">u+hb</w:t>
             </w:r>
           </w:p>
         </w:tc>
@@ -20495,19 +20416,7 @@
               <w:jc w:val="left"/>
             </w:pPr>
             <w:r>
-              <w:t xml:space="preserve">25.1 gmacs</w:t>
-            </w:r>
-            <w:r>
-              <w:t xml:space="preserve"> </w:t>
-            </w:r>
-            <w:r>
-              <w:t xml:space="preserve">(update +</w:t>
-            </w:r>
-            <w:r>
-              <w:t xml:space="preserve"> </w:t>
-            </w:r>
-            <w:r>
-              <w:t xml:space="preserve">hyb_both)</w:t>
+              <w:t xml:space="preserve">u+hb</w:t>
             </w:r>
           </w:p>
         </w:tc>
@@ -20569,19 +20478,7 @@
               <w:jc w:val="left"/>
             </w:pPr>
             <w:r>
-              <w:t xml:space="preserve">25.1 gmacs</w:t>
-            </w:r>
-            <w:r>
-              <w:t xml:space="preserve"> </w:t>
-            </w:r>
-            <w:r>
-              <w:t xml:space="preserve">(update +</w:t>
-            </w:r>
-            <w:r>
-              <w:t xml:space="preserve"> </w:t>
-            </w:r>
-            <w:r>
-              <w:t xml:space="preserve">hyb_both)</w:t>
+              <w:t xml:space="preserve">u+hb</w:t>
             </w:r>
           </w:p>
         </w:tc>
@@ -20643,19 +20540,7 @@
               <w:jc w:val="left"/>
             </w:pPr>
             <w:r>
-              <w:t xml:space="preserve">25.1 gmacs</w:t>
-            </w:r>
-            <w:r>
-              <w:t xml:space="preserve"> </w:t>
-            </w:r>
-            <w:r>
-              <w:t xml:space="preserve">(update +</w:t>
-            </w:r>
-            <w:r>
-              <w:t xml:space="preserve"> </w:t>
-            </w:r>
-            <w:r>
-              <w:t xml:space="preserve">hyb_both)</w:t>
+              <w:t xml:space="preserve">u+hb</w:t>
             </w:r>
           </w:p>
         </w:tc>
@@ -20717,19 +20602,7 @@
               <w:jc w:val="left"/>
             </w:pPr>
             <w:r>
-              <w:t xml:space="preserve">25.1 gmacs</w:t>
-            </w:r>
-            <w:r>
-              <w:t xml:space="preserve"> </w:t>
-            </w:r>
-            <w:r>
-              <w:t xml:space="preserve">(update +</w:t>
-            </w:r>
-            <w:r>
-              <w:t xml:space="preserve"> </w:t>
-            </w:r>
-            <w:r>
-              <w:t xml:space="preserve">hyb_both)</w:t>
+              <w:t xml:space="preserve">u+hb</w:t>
             </w:r>
           </w:p>
         </w:tc>
@@ -20791,19 +20664,7 @@
               <w:jc w:val="left"/>
             </w:pPr>
             <w:r>
-              <w:t xml:space="preserve">25.1 gmacs</w:t>
-            </w:r>
-            <w:r>
-              <w:t xml:space="preserve"> </w:t>
-            </w:r>
-            <w:r>
-              <w:t xml:space="preserve">(update +</w:t>
-            </w:r>
-            <w:r>
-              <w:t xml:space="preserve"> </w:t>
-            </w:r>
-            <w:r>
-              <w:t xml:space="preserve">hyb_both)</w:t>
+              <w:t xml:space="preserve">u+hb</w:t>
             </w:r>
           </w:p>
         </w:tc>
@@ -20865,19 +20726,7 @@
               <w:jc w:val="left"/>
             </w:pPr>
             <w:r>
-              <w:t xml:space="preserve">25.1 gmacs</w:t>
-            </w:r>
-            <w:r>
-              <w:t xml:space="preserve"> </w:t>
-            </w:r>
-            <w:r>
-              <w:t xml:space="preserve">(update +</w:t>
-            </w:r>
-            <w:r>
-              <w:t xml:space="preserve"> </w:t>
-            </w:r>
-            <w:r>
-              <w:t xml:space="preserve">hyb_both)</w:t>
+              <w:t xml:space="preserve">u+hb</w:t>
             </w:r>
           </w:p>
         </w:tc>
@@ -20939,19 +20788,7 @@
               <w:jc w:val="left"/>
             </w:pPr>
             <w:r>
-              <w:t xml:space="preserve">25.1 gmacs</w:t>
-            </w:r>
-            <w:r>
-              <w:t xml:space="preserve"> </w:t>
-            </w:r>
-            <w:r>
-              <w:t xml:space="preserve">(update +</w:t>
-            </w:r>
-            <w:r>
-              <w:t xml:space="preserve"> </w:t>
-            </w:r>
-            <w:r>
-              <w:t xml:space="preserve">hyb_both)</w:t>
+              <w:t xml:space="preserve">u+hb</w:t>
             </w:r>
           </w:p>
         </w:tc>
@@ -21013,19 +20850,7 @@
               <w:jc w:val="left"/>
             </w:pPr>
             <w:r>
-              <w:t xml:space="preserve">25.1 gmacs</w:t>
-            </w:r>
-            <w:r>
-              <w:t xml:space="preserve"> </w:t>
-            </w:r>
-            <w:r>
-              <w:t xml:space="preserve">(update +</w:t>
-            </w:r>
-            <w:r>
-              <w:t xml:space="preserve"> </w:t>
-            </w:r>
-            <w:r>
-              <w:t xml:space="preserve">hyb_both)</w:t>
+              <w:t xml:space="preserve">u+hb</w:t>
             </w:r>
           </w:p>
         </w:tc>
@@ -21087,19 +20912,7 @@
               <w:jc w:val="left"/>
             </w:pPr>
             <w:r>
-              <w:t xml:space="preserve">25.1 gmacs</w:t>
-            </w:r>
-            <w:r>
-              <w:t xml:space="preserve"> </w:t>
-            </w:r>
-            <w:r>
-              <w:t xml:space="preserve">(update +</w:t>
-            </w:r>
-            <w:r>
-              <w:t xml:space="preserve"> </w:t>
-            </w:r>
-            <w:r>
-              <w:t xml:space="preserve">hyb_both)</w:t>
+              <w:t xml:space="preserve">u+hb</w:t>
             </w:r>
           </w:p>
         </w:tc>
@@ -21161,19 +20974,7 @@
               <w:jc w:val="left"/>
             </w:pPr>
             <w:r>
-              <w:t xml:space="preserve">25.1 gmacs</w:t>
-            </w:r>
-            <w:r>
-              <w:t xml:space="preserve"> </w:t>
-            </w:r>
-            <w:r>
-              <w:t xml:space="preserve">(update +</w:t>
-            </w:r>
-            <w:r>
-              <w:t xml:space="preserve"> </w:t>
-            </w:r>
-            <w:r>
-              <w:t xml:space="preserve">hyb_both)</w:t>
+              <w:t xml:space="preserve">u+hb</w:t>
             </w:r>
           </w:p>
         </w:tc>
@@ -21235,19 +21036,7 @@
               <w:jc w:val="left"/>
             </w:pPr>
             <w:r>
-              <w:t xml:space="preserve">25.1 gmacs</w:t>
-            </w:r>
-            <w:r>
-              <w:t xml:space="preserve"> </w:t>
-            </w:r>
-            <w:r>
-              <w:t xml:space="preserve">(update +</w:t>
-            </w:r>
-            <w:r>
-              <w:t xml:space="preserve"> </w:t>
-            </w:r>
-            <w:r>
-              <w:t xml:space="preserve">hyb_both)</w:t>
+              <w:t xml:space="preserve">u+hb</w:t>
             </w:r>
           </w:p>
         </w:tc>
@@ -21309,19 +21098,7 @@
               <w:jc w:val="left"/>
             </w:pPr>
             <w:r>
-              <w:t xml:space="preserve">25.1 gmacs</w:t>
-            </w:r>
-            <w:r>
-              <w:t xml:space="preserve"> </w:t>
-            </w:r>
-            <w:r>
-              <w:t xml:space="preserve">(update +</w:t>
-            </w:r>
-            <w:r>
-              <w:t xml:space="preserve"> </w:t>
-            </w:r>
-            <w:r>
-              <w:t xml:space="preserve">hyb_both)</w:t>
+              <w:t xml:space="preserve">u+hb</w:t>
             </w:r>
           </w:p>
         </w:tc>
@@ -21383,19 +21160,7 @@
               <w:jc w:val="left"/>
             </w:pPr>
             <w:r>
-              <w:t xml:space="preserve">25.1 gmacs</w:t>
-            </w:r>
-            <w:r>
-              <w:t xml:space="preserve"> </w:t>
-            </w:r>
-            <w:r>
-              <w:t xml:space="preserve">(update +</w:t>
-            </w:r>
-            <w:r>
-              <w:t xml:space="preserve"> </w:t>
-            </w:r>
-            <w:r>
-              <w:t xml:space="preserve">hyb_both)</w:t>
+              <w:t xml:space="preserve">u+hb</w:t>
             </w:r>
           </w:p>
         </w:tc>
@@ -21457,19 +21222,7 @@
               <w:jc w:val="left"/>
             </w:pPr>
             <w:r>
-              <w:t xml:space="preserve">25.1 gmacs</w:t>
-            </w:r>
-            <w:r>
-              <w:t xml:space="preserve"> </w:t>
-            </w:r>
-            <w:r>
-              <w:t xml:space="preserve">(update +</w:t>
-            </w:r>
-            <w:r>
-              <w:t xml:space="preserve"> </w:t>
-            </w:r>
-            <w:r>
-              <w:t xml:space="preserve">hyb_both)</w:t>
+              <w:t xml:space="preserve">u+hb</w:t>
             </w:r>
           </w:p>
         </w:tc>
@@ -21531,19 +21284,7 @@
               <w:jc w:val="left"/>
             </w:pPr>
             <w:r>
-              <w:t xml:space="preserve">25.1 gmacs</w:t>
-            </w:r>
-            <w:r>
-              <w:t xml:space="preserve"> </w:t>
-            </w:r>
-            <w:r>
-              <w:t xml:space="preserve">(update +</w:t>
-            </w:r>
-            <w:r>
-              <w:t xml:space="preserve"> </w:t>
-            </w:r>
-            <w:r>
-              <w:t xml:space="preserve">hyb_both)</w:t>
+              <w:t xml:space="preserve">u+hb</w:t>
             </w:r>
           </w:p>
         </w:tc>
@@ -21605,19 +21346,7 @@
               <w:jc w:val="left"/>
             </w:pPr>
             <w:r>
-              <w:t xml:space="preserve">25.1 gmacs</w:t>
-            </w:r>
-            <w:r>
-              <w:t xml:space="preserve"> </w:t>
-            </w:r>
-            <w:r>
-              <w:t xml:space="preserve">(update +</w:t>
-            </w:r>
-            <w:r>
-              <w:t xml:space="preserve"> </w:t>
-            </w:r>
-            <w:r>
-              <w:t xml:space="preserve">hyb_both)</w:t>
+              <w:t xml:space="preserve">u+hb</w:t>
             </w:r>
           </w:p>
         </w:tc>
@@ -21679,19 +21408,7 @@
               <w:jc w:val="left"/>
             </w:pPr>
             <w:r>
-              <w:t xml:space="preserve">25.1 gmacs</w:t>
-            </w:r>
-            <w:r>
-              <w:t xml:space="preserve"> </w:t>
-            </w:r>
-            <w:r>
-              <w:t xml:space="preserve">(update +</w:t>
-            </w:r>
-            <w:r>
-              <w:t xml:space="preserve"> </w:t>
-            </w:r>
-            <w:r>
-              <w:t xml:space="preserve">hyb_both)</w:t>
+              <w:t xml:space="preserve">u+hb</w:t>
             </w:r>
           </w:p>
         </w:tc>
@@ -21753,25 +21470,7 @@
               <w:jc w:val="left"/>
             </w:pPr>
             <w:r>
-              <w:t xml:space="preserve">25.1 gmacs</w:t>
-            </w:r>
-            <w:r>
-              <w:t xml:space="preserve"> </w:t>
-            </w:r>
-            <w:r>
-              <w:t xml:space="preserve">(update +</w:t>
-            </w:r>
-            <w:r>
-              <w:t xml:space="preserve"> </w:t>
-            </w:r>
-            <w:r>
-              <w:t xml:space="preserve">plus</w:t>
-            </w:r>
-            <w:r>
-              <w:t xml:space="preserve"> </w:t>
-            </w:r>
-            <w:r>
-              <w:t xml:space="preserve">group)</w:t>
+              <w:t xml:space="preserve">u+pg</w:t>
             </w:r>
           </w:p>
         </w:tc>
@@ -21833,25 +21532,7 @@
               <w:jc w:val="left"/>
             </w:pPr>
             <w:r>
-              <w:t xml:space="preserve">25.1 gmacs</w:t>
-            </w:r>
-            <w:r>
-              <w:t xml:space="preserve"> </w:t>
-            </w:r>
-            <w:r>
-              <w:t xml:space="preserve">(update +</w:t>
-            </w:r>
-            <w:r>
-              <w:t xml:space="preserve"> </w:t>
-            </w:r>
-            <w:r>
-              <w:t xml:space="preserve">plus</w:t>
-            </w:r>
-            <w:r>
-              <w:t xml:space="preserve"> </w:t>
-            </w:r>
-            <w:r>
-              <w:t xml:space="preserve">group)</w:t>
+              <w:t xml:space="preserve">u+pg</w:t>
             </w:r>
           </w:p>
         </w:tc>
@@ -21913,25 +21594,7 @@
               <w:jc w:val="left"/>
             </w:pPr>
             <w:r>
-              <w:t xml:space="preserve">25.1 gmacs</w:t>
-            </w:r>
-            <w:r>
-              <w:t xml:space="preserve"> </w:t>
-            </w:r>
-            <w:r>
-              <w:t xml:space="preserve">(update +</w:t>
-            </w:r>
-            <w:r>
-              <w:t xml:space="preserve"> </w:t>
-            </w:r>
-            <w:r>
-              <w:t xml:space="preserve">plus</w:t>
-            </w:r>
-            <w:r>
-              <w:t xml:space="preserve"> </w:t>
-            </w:r>
-            <w:r>
-              <w:t xml:space="preserve">group)</w:t>
+              <w:t xml:space="preserve">u+pg</w:t>
             </w:r>
           </w:p>
         </w:tc>
@@ -21993,25 +21656,7 @@
               <w:jc w:val="left"/>
             </w:pPr>
             <w:r>
-              <w:t xml:space="preserve">25.1 gmacs</w:t>
-            </w:r>
-            <w:r>
-              <w:t xml:space="preserve"> </w:t>
-            </w:r>
-            <w:r>
-              <w:t xml:space="preserve">(update +</w:t>
-            </w:r>
-            <w:r>
-              <w:t xml:space="preserve"> </w:t>
-            </w:r>
-            <w:r>
-              <w:t xml:space="preserve">plus</w:t>
-            </w:r>
-            <w:r>
-              <w:t xml:space="preserve"> </w:t>
-            </w:r>
-            <w:r>
-              <w:t xml:space="preserve">group)</w:t>
+              <w:t xml:space="preserve">u+pg</w:t>
             </w:r>
           </w:p>
         </w:tc>
@@ -22073,25 +21718,7 @@
               <w:jc w:val="left"/>
             </w:pPr>
             <w:r>
-              <w:t xml:space="preserve">25.1 gmacs</w:t>
-            </w:r>
-            <w:r>
-              <w:t xml:space="preserve"> </w:t>
-            </w:r>
-            <w:r>
-              <w:t xml:space="preserve">(update +</w:t>
-            </w:r>
-            <w:r>
-              <w:t xml:space="preserve"> </w:t>
-            </w:r>
-            <w:r>
-              <w:t xml:space="preserve">plus</w:t>
-            </w:r>
-            <w:r>
-              <w:t xml:space="preserve"> </w:t>
-            </w:r>
-            <w:r>
-              <w:t xml:space="preserve">group)</w:t>
+              <w:t xml:space="preserve">u+pg</w:t>
             </w:r>
           </w:p>
         </w:tc>
@@ -22153,25 +21780,7 @@
               <w:jc w:val="left"/>
             </w:pPr>
             <w:r>
-              <w:t xml:space="preserve">25.1 gmacs</w:t>
-            </w:r>
-            <w:r>
-              <w:t xml:space="preserve"> </w:t>
-            </w:r>
-            <w:r>
-              <w:t xml:space="preserve">(update +</w:t>
-            </w:r>
-            <w:r>
-              <w:t xml:space="preserve"> </w:t>
-            </w:r>
-            <w:r>
-              <w:t xml:space="preserve">plus</w:t>
-            </w:r>
-            <w:r>
-              <w:t xml:space="preserve"> </w:t>
-            </w:r>
-            <w:r>
-              <w:t xml:space="preserve">group)</w:t>
+              <w:t xml:space="preserve">u+pg</w:t>
             </w:r>
           </w:p>
         </w:tc>
@@ -22233,25 +21842,7 @@
               <w:jc w:val="left"/>
             </w:pPr>
             <w:r>
-              <w:t xml:space="preserve">25.1 gmacs</w:t>
-            </w:r>
-            <w:r>
-              <w:t xml:space="preserve"> </w:t>
-            </w:r>
-            <w:r>
-              <w:t xml:space="preserve">(update +</w:t>
-            </w:r>
-            <w:r>
-              <w:t xml:space="preserve"> </w:t>
-            </w:r>
-            <w:r>
-              <w:t xml:space="preserve">plus</w:t>
-            </w:r>
-            <w:r>
-              <w:t xml:space="preserve"> </w:t>
-            </w:r>
-            <w:r>
-              <w:t xml:space="preserve">group)</w:t>
+              <w:t xml:space="preserve">u+pg</w:t>
             </w:r>
           </w:p>
         </w:tc>
@@ -22313,25 +21904,7 @@
               <w:jc w:val="left"/>
             </w:pPr>
             <w:r>
-              <w:t xml:space="preserve">25.1 gmacs</w:t>
-            </w:r>
-            <w:r>
-              <w:t xml:space="preserve"> </w:t>
-            </w:r>
-            <w:r>
-              <w:t xml:space="preserve">(update +</w:t>
-            </w:r>
-            <w:r>
-              <w:t xml:space="preserve"> </w:t>
-            </w:r>
-            <w:r>
-              <w:t xml:space="preserve">plus</w:t>
-            </w:r>
-            <w:r>
-              <w:t xml:space="preserve"> </w:t>
-            </w:r>
-            <w:r>
-              <w:t xml:space="preserve">group)</w:t>
+              <w:t xml:space="preserve">u+pg</w:t>
             </w:r>
           </w:p>
         </w:tc>
@@ -22393,25 +21966,7 @@
               <w:jc w:val="left"/>
             </w:pPr>
             <w:r>
-              <w:t xml:space="preserve">25.1 gmacs</w:t>
-            </w:r>
-            <w:r>
-              <w:t xml:space="preserve"> </w:t>
-            </w:r>
-            <w:r>
-              <w:t xml:space="preserve">(update +</w:t>
-            </w:r>
-            <w:r>
-              <w:t xml:space="preserve"> </w:t>
-            </w:r>
-            <w:r>
-              <w:t xml:space="preserve">plus</w:t>
-            </w:r>
-            <w:r>
-              <w:t xml:space="preserve"> </w:t>
-            </w:r>
-            <w:r>
-              <w:t xml:space="preserve">group)</w:t>
+              <w:t xml:space="preserve">u+pg</w:t>
             </w:r>
           </w:p>
         </w:tc>
@@ -22473,25 +22028,7 @@
               <w:jc w:val="left"/>
             </w:pPr>
             <w:r>
-              <w:t xml:space="preserve">25.1 gmacs</w:t>
-            </w:r>
-            <w:r>
-              <w:t xml:space="preserve"> </w:t>
-            </w:r>
-            <w:r>
-              <w:t xml:space="preserve">(update +</w:t>
-            </w:r>
-            <w:r>
-              <w:t xml:space="preserve"> </w:t>
-            </w:r>
-            <w:r>
-              <w:t xml:space="preserve">plus</w:t>
-            </w:r>
-            <w:r>
-              <w:t xml:space="preserve"> </w:t>
-            </w:r>
-            <w:r>
-              <w:t xml:space="preserve">group)</w:t>
+              <w:t xml:space="preserve">u+pg</w:t>
             </w:r>
           </w:p>
         </w:tc>
@@ -22553,25 +22090,7 @@
               <w:jc w:val="left"/>
             </w:pPr>
             <w:r>
-              <w:t xml:space="preserve">25.1 gmacs</w:t>
-            </w:r>
-            <w:r>
-              <w:t xml:space="preserve"> </w:t>
-            </w:r>
-            <w:r>
-              <w:t xml:space="preserve">(update +</w:t>
-            </w:r>
-            <w:r>
-              <w:t xml:space="preserve"> </w:t>
-            </w:r>
-            <w:r>
-              <w:t xml:space="preserve">plus</w:t>
-            </w:r>
-            <w:r>
-              <w:t xml:space="preserve"> </w:t>
-            </w:r>
-            <w:r>
-              <w:t xml:space="preserve">group)</w:t>
+              <w:t xml:space="preserve">u+pg</w:t>
             </w:r>
           </w:p>
         </w:tc>
@@ -22633,25 +22152,7 @@
               <w:jc w:val="left"/>
             </w:pPr>
             <w:r>
-              <w:t xml:space="preserve">25.1 gmacs</w:t>
-            </w:r>
-            <w:r>
-              <w:t xml:space="preserve"> </w:t>
-            </w:r>
-            <w:r>
-              <w:t xml:space="preserve">(update +</w:t>
-            </w:r>
-            <w:r>
-              <w:t xml:space="preserve"> </w:t>
-            </w:r>
-            <w:r>
-              <w:t xml:space="preserve">plus</w:t>
-            </w:r>
-            <w:r>
-              <w:t xml:space="preserve"> </w:t>
-            </w:r>
-            <w:r>
-              <w:t xml:space="preserve">group)</w:t>
+              <w:t xml:space="preserve">u+pg</w:t>
             </w:r>
           </w:p>
         </w:tc>
@@ -22713,25 +22214,7 @@
               <w:jc w:val="left"/>
             </w:pPr>
             <w:r>
-              <w:t xml:space="preserve">25.1 gmacs</w:t>
-            </w:r>
-            <w:r>
-              <w:t xml:space="preserve"> </w:t>
-            </w:r>
-            <w:r>
-              <w:t xml:space="preserve">(update +</w:t>
-            </w:r>
-            <w:r>
-              <w:t xml:space="preserve"> </w:t>
-            </w:r>
-            <w:r>
-              <w:t xml:space="preserve">plus</w:t>
-            </w:r>
-            <w:r>
-              <w:t xml:space="preserve"> </w:t>
-            </w:r>
-            <w:r>
-              <w:t xml:space="preserve">group)</w:t>
+              <w:t xml:space="preserve">u+pg</w:t>
             </w:r>
           </w:p>
         </w:tc>
@@ -22793,25 +22276,7 @@
               <w:jc w:val="left"/>
             </w:pPr>
             <w:r>
-              <w:t xml:space="preserve">25.1 gmacs</w:t>
-            </w:r>
-            <w:r>
-              <w:t xml:space="preserve"> </w:t>
-            </w:r>
-            <w:r>
-              <w:t xml:space="preserve">(update +</w:t>
-            </w:r>
-            <w:r>
-              <w:t xml:space="preserve"> </w:t>
-            </w:r>
-            <w:r>
-              <w:t xml:space="preserve">plus</w:t>
-            </w:r>
-            <w:r>
-              <w:t xml:space="preserve"> </w:t>
-            </w:r>
-            <w:r>
-              <w:t xml:space="preserve">group)</w:t>
+              <w:t xml:space="preserve">u+pg</w:t>
             </w:r>
           </w:p>
         </w:tc>
@@ -22873,25 +22338,7 @@
               <w:jc w:val="left"/>
             </w:pPr>
             <w:r>
-              <w:t xml:space="preserve">25.1 gmacs</w:t>
-            </w:r>
-            <w:r>
-              <w:t xml:space="preserve"> </w:t>
-            </w:r>
-            <w:r>
-              <w:t xml:space="preserve">(update +</w:t>
-            </w:r>
-            <w:r>
-              <w:t xml:space="preserve"> </w:t>
-            </w:r>
-            <w:r>
-              <w:t xml:space="preserve">plus</w:t>
-            </w:r>
-            <w:r>
-              <w:t xml:space="preserve"> </w:t>
-            </w:r>
-            <w:r>
-              <w:t xml:space="preserve">group)</w:t>
+              <w:t xml:space="preserve">u+pg</w:t>
             </w:r>
           </w:p>
         </w:tc>
@@ -22953,25 +22400,7 @@
               <w:jc w:val="left"/>
             </w:pPr>
             <w:r>
-              <w:t xml:space="preserve">25.1 gmacs</w:t>
-            </w:r>
-            <w:r>
-              <w:t xml:space="preserve"> </w:t>
-            </w:r>
-            <w:r>
-              <w:t xml:space="preserve">(update +</w:t>
-            </w:r>
-            <w:r>
-              <w:t xml:space="preserve"> </w:t>
-            </w:r>
-            <w:r>
-              <w:t xml:space="preserve">plus</w:t>
-            </w:r>
-            <w:r>
-              <w:t xml:space="preserve"> </w:t>
-            </w:r>
-            <w:r>
-              <w:t xml:space="preserve">group)</w:t>
+              <w:t xml:space="preserve">u+pg</w:t>
             </w:r>
           </w:p>
         </w:tc>
@@ -23033,25 +22462,7 @@
               <w:jc w:val="left"/>
             </w:pPr>
             <w:r>
-              <w:t xml:space="preserve">25.1 gmacs</w:t>
-            </w:r>
-            <w:r>
-              <w:t xml:space="preserve"> </w:t>
-            </w:r>
-            <w:r>
-              <w:t xml:space="preserve">(update +</w:t>
-            </w:r>
-            <w:r>
-              <w:t xml:space="preserve"> </w:t>
-            </w:r>
-            <w:r>
-              <w:t xml:space="preserve">plus</w:t>
-            </w:r>
-            <w:r>
-              <w:t xml:space="preserve"> </w:t>
-            </w:r>
-            <w:r>
-              <w:t xml:space="preserve">group)</w:t>
+              <w:t xml:space="preserve">u+pg</w:t>
             </w:r>
           </w:p>
         </w:tc>
@@ -23113,25 +22524,7 @@
               <w:jc w:val="left"/>
             </w:pPr>
             <w:r>
-              <w:t xml:space="preserve">25.1 gmacs</w:t>
-            </w:r>
-            <w:r>
-              <w:t xml:space="preserve"> </w:t>
-            </w:r>
-            <w:r>
-              <w:t xml:space="preserve">(update +</w:t>
-            </w:r>
-            <w:r>
-              <w:t xml:space="preserve"> </w:t>
-            </w:r>
-            <w:r>
-              <w:t xml:space="preserve">plus</w:t>
-            </w:r>
-            <w:r>
-              <w:t xml:space="preserve"> </w:t>
-            </w:r>
-            <w:r>
-              <w:t xml:space="preserve">group)</w:t>
+              <w:t xml:space="preserve">u+pg</w:t>
             </w:r>
           </w:p>
         </w:tc>
@@ -23193,25 +22586,7 @@
               <w:jc w:val="left"/>
             </w:pPr>
             <w:r>
-              <w:t xml:space="preserve">25.1 gmacs</w:t>
-            </w:r>
-            <w:r>
-              <w:t xml:space="preserve"> </w:t>
-            </w:r>
-            <w:r>
-              <w:t xml:space="preserve">(update +</w:t>
-            </w:r>
-            <w:r>
-              <w:t xml:space="preserve"> </w:t>
-            </w:r>
-            <w:r>
-              <w:t xml:space="preserve">plus</w:t>
-            </w:r>
-            <w:r>
-              <w:t xml:space="preserve"> </w:t>
-            </w:r>
-            <w:r>
-              <w:t xml:space="preserve">group)</w:t>
+              <w:t xml:space="preserve">u+pg</w:t>
             </w:r>
           </w:p>
         </w:tc>
@@ -23273,25 +22648,7 @@
               <w:jc w:val="left"/>
             </w:pPr>
             <w:r>
-              <w:t xml:space="preserve">25.1 gmacs</w:t>
-            </w:r>
-            <w:r>
-              <w:t xml:space="preserve"> </w:t>
-            </w:r>
-            <w:r>
-              <w:t xml:space="preserve">(update +</w:t>
-            </w:r>
-            <w:r>
-              <w:t xml:space="preserve"> </w:t>
-            </w:r>
-            <w:r>
-              <w:t xml:space="preserve">plus</w:t>
-            </w:r>
-            <w:r>
-              <w:t xml:space="preserve"> </w:t>
-            </w:r>
-            <w:r>
-              <w:t xml:space="preserve">group)</w:t>
+              <w:t xml:space="preserve">u+pg</w:t>
             </w:r>
           </w:p>
         </w:tc>
@@ -23353,25 +22710,7 @@
               <w:jc w:val="left"/>
             </w:pPr>
             <w:r>
-              <w:t xml:space="preserve">25.1 gmacs</w:t>
-            </w:r>
-            <w:r>
-              <w:t xml:space="preserve"> </w:t>
-            </w:r>
-            <w:r>
-              <w:t xml:space="preserve">(update +</w:t>
-            </w:r>
-            <w:r>
-              <w:t xml:space="preserve"> </w:t>
-            </w:r>
-            <w:r>
-              <w:t xml:space="preserve">plus</w:t>
-            </w:r>
-            <w:r>
-              <w:t xml:space="preserve"> </w:t>
-            </w:r>
-            <w:r>
-              <w:t xml:space="preserve">group)</w:t>
+              <w:t xml:space="preserve">u+pg</w:t>
             </w:r>
           </w:p>
         </w:tc>
@@ -23433,25 +22772,7 @@
               <w:jc w:val="left"/>
             </w:pPr>
             <w:r>
-              <w:t xml:space="preserve">25.1 gmacs</w:t>
-            </w:r>
-            <w:r>
-              <w:t xml:space="preserve"> </w:t>
-            </w:r>
-            <w:r>
-              <w:t xml:space="preserve">(update +</w:t>
-            </w:r>
-            <w:r>
-              <w:t xml:space="preserve"> </w:t>
-            </w:r>
-            <w:r>
-              <w:t xml:space="preserve">plus</w:t>
-            </w:r>
-            <w:r>
-              <w:t xml:space="preserve"> </w:t>
-            </w:r>
-            <w:r>
-              <w:t xml:space="preserve">group)</w:t>
+              <w:t xml:space="preserve">u+pg</w:t>
             </w:r>
           </w:p>
         </w:tc>
@@ -23513,25 +22834,7 @@
               <w:jc w:val="left"/>
             </w:pPr>
             <w:r>
-              <w:t xml:space="preserve">25.1 gmacs</w:t>
-            </w:r>
-            <w:r>
-              <w:t xml:space="preserve"> </w:t>
-            </w:r>
-            <w:r>
-              <w:t xml:space="preserve">(update +</w:t>
-            </w:r>
-            <w:r>
-              <w:t xml:space="preserve"> </w:t>
-            </w:r>
-            <w:r>
-              <w:t xml:space="preserve">plus</w:t>
-            </w:r>
-            <w:r>
-              <w:t xml:space="preserve"> </w:t>
-            </w:r>
-            <w:r>
-              <w:t xml:space="preserve">group)</w:t>
+              <w:t xml:space="preserve">u+pg</w:t>
             </w:r>
           </w:p>
         </w:tc>
@@ -23593,25 +22896,7 @@
               <w:jc w:val="left"/>
             </w:pPr>
             <w:r>
-              <w:t xml:space="preserve">25.1 gmacs</w:t>
-            </w:r>
-            <w:r>
-              <w:t xml:space="preserve"> </w:t>
-            </w:r>
-            <w:r>
-              <w:t xml:space="preserve">(update +</w:t>
-            </w:r>
-            <w:r>
-              <w:t xml:space="preserve"> </w:t>
-            </w:r>
-            <w:r>
-              <w:t xml:space="preserve">plus</w:t>
-            </w:r>
-            <w:r>
-              <w:t xml:space="preserve"> </w:t>
-            </w:r>
-            <w:r>
-              <w:t xml:space="preserve">group)</w:t>
+              <w:t xml:space="preserve">u+pg</w:t>
             </w:r>
           </w:p>
         </w:tc>
@@ -23673,25 +22958,7 @@
               <w:jc w:val="left"/>
             </w:pPr>
             <w:r>
-              <w:t xml:space="preserve">25.1 gmacs</w:t>
-            </w:r>
-            <w:r>
-              <w:t xml:space="preserve"> </w:t>
-            </w:r>
-            <w:r>
-              <w:t xml:space="preserve">(update +</w:t>
-            </w:r>
-            <w:r>
-              <w:t xml:space="preserve"> </w:t>
-            </w:r>
-            <w:r>
-              <w:t xml:space="preserve">plus</w:t>
-            </w:r>
-            <w:r>
-              <w:t xml:space="preserve"> </w:t>
-            </w:r>
-            <w:r>
-              <w:t xml:space="preserve">group)</w:t>
+              <w:t xml:space="preserve">u+pg</w:t>
             </w:r>
           </w:p>
         </w:tc>
@@ -23753,25 +23020,7 @@
               <w:jc w:val="left"/>
             </w:pPr>
             <w:r>
-              <w:t xml:space="preserve">25.1 gmacs</w:t>
-            </w:r>
-            <w:r>
-              <w:t xml:space="preserve"> </w:t>
-            </w:r>
-            <w:r>
-              <w:t xml:space="preserve">(update +</w:t>
-            </w:r>
-            <w:r>
-              <w:t xml:space="preserve"> </w:t>
-            </w:r>
-            <w:r>
-              <w:t xml:space="preserve">plus</w:t>
-            </w:r>
-            <w:r>
-              <w:t xml:space="preserve"> </w:t>
-            </w:r>
-            <w:r>
-              <w:t xml:space="preserve">group)</w:t>
+              <w:t xml:space="preserve">u+pg</w:t>
             </w:r>
           </w:p>
         </w:tc>
@@ -23833,25 +23082,7 @@
               <w:jc w:val="left"/>
             </w:pPr>
             <w:r>
-              <w:t xml:space="preserve">25.1 gmacs</w:t>
-            </w:r>
-            <w:r>
-              <w:t xml:space="preserve"> </w:t>
-            </w:r>
-            <w:r>
-              <w:t xml:space="preserve">(update +</w:t>
-            </w:r>
-            <w:r>
-              <w:t xml:space="preserve"> </w:t>
-            </w:r>
-            <w:r>
-              <w:t xml:space="preserve">plus</w:t>
-            </w:r>
-            <w:r>
-              <w:t xml:space="preserve"> </w:t>
-            </w:r>
-            <w:r>
-              <w:t xml:space="preserve">group)</w:t>
+              <w:t xml:space="preserve">u+pg</w:t>
             </w:r>
           </w:p>
         </w:tc>
@@ -23913,25 +23144,7 @@
               <w:jc w:val="left"/>
             </w:pPr>
             <w:r>
-              <w:t xml:space="preserve">25.1 gmacs</w:t>
-            </w:r>
-            <w:r>
-              <w:t xml:space="preserve"> </w:t>
-            </w:r>
-            <w:r>
-              <w:t xml:space="preserve">(update +</w:t>
-            </w:r>
-            <w:r>
-              <w:t xml:space="preserve"> </w:t>
-            </w:r>
-            <w:r>
-              <w:t xml:space="preserve">plus</w:t>
-            </w:r>
-            <w:r>
-              <w:t xml:space="preserve"> </w:t>
-            </w:r>
-            <w:r>
-              <w:t xml:space="preserve">group)</w:t>
+              <w:t xml:space="preserve">u+pg</w:t>
             </w:r>
           </w:p>
         </w:tc>
@@ -23993,25 +23206,7 @@
               <w:jc w:val="left"/>
             </w:pPr>
             <w:r>
-              <w:t xml:space="preserve">25.1 gmacs</w:t>
-            </w:r>
-            <w:r>
-              <w:t xml:space="preserve"> </w:t>
-            </w:r>
-            <w:r>
-              <w:t xml:space="preserve">(update +</w:t>
-            </w:r>
-            <w:r>
-              <w:t xml:space="preserve"> </w:t>
-            </w:r>
-            <w:r>
-              <w:t xml:space="preserve">plus</w:t>
-            </w:r>
-            <w:r>
-              <w:t xml:space="preserve"> </w:t>
-            </w:r>
-            <w:r>
-              <w:t xml:space="preserve">group)</w:t>
+              <w:t xml:space="preserve">u+pg</w:t>
             </w:r>
           </w:p>
         </w:tc>
@@ -24073,25 +23268,7 @@
               <w:jc w:val="left"/>
             </w:pPr>
             <w:r>
-              <w:t xml:space="preserve">25.1 gmacs</w:t>
-            </w:r>
-            <w:r>
-              <w:t xml:space="preserve"> </w:t>
-            </w:r>
-            <w:r>
-              <w:t xml:space="preserve">(update +</w:t>
-            </w:r>
-            <w:r>
-              <w:t xml:space="preserve"> </w:t>
-            </w:r>
-            <w:r>
-              <w:t xml:space="preserve">plus</w:t>
-            </w:r>
-            <w:r>
-              <w:t xml:space="preserve"> </w:t>
-            </w:r>
-            <w:r>
-              <w:t xml:space="preserve">group)</w:t>
+              <w:t xml:space="preserve">u+pg</w:t>
             </w:r>
           </w:p>
         </w:tc>
@@ -24153,25 +23330,7 @@
               <w:jc w:val="left"/>
             </w:pPr>
             <w:r>
-              <w:t xml:space="preserve">25.1 gmacs</w:t>
-            </w:r>
-            <w:r>
-              <w:t xml:space="preserve"> </w:t>
-            </w:r>
-            <w:r>
-              <w:t xml:space="preserve">(update +</w:t>
-            </w:r>
-            <w:r>
-              <w:t xml:space="preserve"> </w:t>
-            </w:r>
-            <w:r>
-              <w:t xml:space="preserve">plus</w:t>
-            </w:r>
-            <w:r>
-              <w:t xml:space="preserve"> </w:t>
-            </w:r>
-            <w:r>
-              <w:t xml:space="preserve">group)</w:t>
+              <w:t xml:space="preserve">u+pg</w:t>
             </w:r>
           </w:p>
         </w:tc>
@@ -24233,25 +23392,7 @@
               <w:jc w:val="left"/>
             </w:pPr>
             <w:r>
-              <w:t xml:space="preserve">25.1 gmacs</w:t>
-            </w:r>
-            <w:r>
-              <w:t xml:space="preserve"> </w:t>
-            </w:r>
-            <w:r>
-              <w:t xml:space="preserve">(update +</w:t>
-            </w:r>
-            <w:r>
-              <w:t xml:space="preserve"> </w:t>
-            </w:r>
-            <w:r>
-              <w:t xml:space="preserve">plus</w:t>
-            </w:r>
-            <w:r>
-              <w:t xml:space="preserve"> </w:t>
-            </w:r>
-            <w:r>
-              <w:t xml:space="preserve">group)</w:t>
+              <w:t xml:space="preserve">u+pg</w:t>
             </w:r>
           </w:p>
         </w:tc>
@@ -24313,25 +23454,7 @@
               <w:jc w:val="left"/>
             </w:pPr>
             <w:r>
-              <w:t xml:space="preserve">25.1 gmacs</w:t>
-            </w:r>
-            <w:r>
-              <w:t xml:space="preserve"> </w:t>
-            </w:r>
-            <w:r>
-              <w:t xml:space="preserve">(update +</w:t>
-            </w:r>
-            <w:r>
-              <w:t xml:space="preserve"> </w:t>
-            </w:r>
-            <w:r>
-              <w:t xml:space="preserve">plus</w:t>
-            </w:r>
-            <w:r>
-              <w:t xml:space="preserve"> </w:t>
-            </w:r>
-            <w:r>
-              <w:t xml:space="preserve">group)</w:t>
+              <w:t xml:space="preserve">u+pg</w:t>
             </w:r>
           </w:p>
         </w:tc>
@@ -24393,25 +23516,7 @@
               <w:jc w:val="left"/>
             </w:pPr>
             <w:r>
-              <w:t xml:space="preserve">25.1 gmacs</w:t>
-            </w:r>
-            <w:r>
-              <w:t xml:space="preserve"> </w:t>
-            </w:r>
-            <w:r>
-              <w:t xml:space="preserve">(update +</w:t>
-            </w:r>
-            <w:r>
-              <w:t xml:space="preserve"> </w:t>
-            </w:r>
-            <w:r>
-              <w:t xml:space="preserve">plus</w:t>
-            </w:r>
-            <w:r>
-              <w:t xml:space="preserve"> </w:t>
-            </w:r>
-            <w:r>
-              <w:t xml:space="preserve">group)</w:t>
+              <w:t xml:space="preserve">u+pg</w:t>
             </w:r>
           </w:p>
         </w:tc>
@@ -24473,25 +23578,7 @@
               <w:jc w:val="left"/>
             </w:pPr>
             <w:r>
-              <w:t xml:space="preserve">25.1 gmacs</w:t>
-            </w:r>
-            <w:r>
-              <w:t xml:space="preserve"> </w:t>
-            </w:r>
-            <w:r>
-              <w:t xml:space="preserve">(update +</w:t>
-            </w:r>
-            <w:r>
-              <w:t xml:space="preserve"> </w:t>
-            </w:r>
-            <w:r>
-              <w:t xml:space="preserve">plus</w:t>
-            </w:r>
-            <w:r>
-              <w:t xml:space="preserve"> </w:t>
-            </w:r>
-            <w:r>
-              <w:t xml:space="preserve">group)</w:t>
+              <w:t xml:space="preserve">u+pg</w:t>
             </w:r>
           </w:p>
         </w:tc>
@@ -24553,25 +23640,7 @@
               <w:jc w:val="left"/>
             </w:pPr>
             <w:r>
-              <w:t xml:space="preserve">25.1 gmacs</w:t>
-            </w:r>
-            <w:r>
-              <w:t xml:space="preserve"> </w:t>
-            </w:r>
-            <w:r>
-              <w:t xml:space="preserve">(update +</w:t>
-            </w:r>
-            <w:r>
-              <w:t xml:space="preserve"> </w:t>
-            </w:r>
-            <w:r>
-              <w:t xml:space="preserve">plus</w:t>
-            </w:r>
-            <w:r>
-              <w:t xml:space="preserve"> </w:t>
-            </w:r>
-            <w:r>
-              <w:t xml:space="preserve">group)</w:t>
+              <w:t xml:space="preserve">u+pg</w:t>
             </w:r>
           </w:p>
         </w:tc>
@@ -24633,25 +23702,7 @@
               <w:jc w:val="left"/>
             </w:pPr>
             <w:r>
-              <w:t xml:space="preserve">25.1 gmacs</w:t>
-            </w:r>
-            <w:r>
-              <w:t xml:space="preserve"> </w:t>
-            </w:r>
-            <w:r>
-              <w:t xml:space="preserve">(update +</w:t>
-            </w:r>
-            <w:r>
-              <w:t xml:space="preserve"> </w:t>
-            </w:r>
-            <w:r>
-              <w:t xml:space="preserve">plus</w:t>
-            </w:r>
-            <w:r>
-              <w:t xml:space="preserve"> </w:t>
-            </w:r>
-            <w:r>
-              <w:t xml:space="preserve">group)</w:t>
+              <w:t xml:space="preserve">u+pg</w:t>
             </w:r>
           </w:p>
         </w:tc>
@@ -24713,25 +23764,7 @@
               <w:jc w:val="left"/>
             </w:pPr>
             <w:r>
-              <w:t xml:space="preserve">25.1 gmacs</w:t>
-            </w:r>
-            <w:r>
-              <w:t xml:space="preserve"> </w:t>
-            </w:r>
-            <w:r>
-              <w:t xml:space="preserve">(update +</w:t>
-            </w:r>
-            <w:r>
-              <w:t xml:space="preserve"> </w:t>
-            </w:r>
-            <w:r>
-              <w:t xml:space="preserve">plus</w:t>
-            </w:r>
-            <w:r>
-              <w:t xml:space="preserve"> </w:t>
-            </w:r>
-            <w:r>
-              <w:t xml:space="preserve">group)</w:t>
+              <w:t xml:space="preserve">u+pg</w:t>
             </w:r>
           </w:p>
         </w:tc>
@@ -24793,25 +23826,7 @@
               <w:jc w:val="left"/>
             </w:pPr>
             <w:r>
-              <w:t xml:space="preserve">25.1 gmacs</w:t>
-            </w:r>
-            <w:r>
-              <w:t xml:space="preserve"> </w:t>
-            </w:r>
-            <w:r>
-              <w:t xml:space="preserve">(update +</w:t>
-            </w:r>
-            <w:r>
-              <w:t xml:space="preserve"> </w:t>
-            </w:r>
-            <w:r>
-              <w:t xml:space="preserve">plus</w:t>
-            </w:r>
-            <w:r>
-              <w:t xml:space="preserve"> </w:t>
-            </w:r>
-            <w:r>
-              <w:t xml:space="preserve">group)</w:t>
+              <w:t xml:space="preserve">u+pg</w:t>
             </w:r>
           </w:p>
         </w:tc>
@@ -24873,25 +23888,7 @@
               <w:jc w:val="left"/>
             </w:pPr>
             <w:r>
-              <w:t xml:space="preserve">25.1 gmacs</w:t>
-            </w:r>
-            <w:r>
-              <w:t xml:space="preserve"> </w:t>
-            </w:r>
-            <w:r>
-              <w:t xml:space="preserve">(update +</w:t>
-            </w:r>
-            <w:r>
-              <w:t xml:space="preserve"> </w:t>
-            </w:r>
-            <w:r>
-              <w:t xml:space="preserve">plus</w:t>
-            </w:r>
-            <w:r>
-              <w:t xml:space="preserve"> </w:t>
-            </w:r>
-            <w:r>
-              <w:t xml:space="preserve">group)</w:t>
+              <w:t xml:space="preserve">u+pg</w:t>
             </w:r>
           </w:p>
         </w:tc>
@@ -24953,25 +23950,7 @@
               <w:jc w:val="left"/>
             </w:pPr>
             <w:r>
-              <w:t xml:space="preserve">25.1 gmacs</w:t>
-            </w:r>
-            <w:r>
-              <w:t xml:space="preserve"> </w:t>
-            </w:r>
-            <w:r>
-              <w:t xml:space="preserve">(update +</w:t>
-            </w:r>
-            <w:r>
-              <w:t xml:space="preserve"> </w:t>
-            </w:r>
-            <w:r>
-              <w:t xml:space="preserve">plus</w:t>
-            </w:r>
-            <w:r>
-              <w:t xml:space="preserve"> </w:t>
-            </w:r>
-            <w:r>
-              <w:t xml:space="preserve">group)</w:t>
+              <w:t xml:space="preserve">u+pg</w:t>
             </w:r>
           </w:p>
         </w:tc>
@@ -25033,25 +24012,7 @@
               <w:jc w:val="left"/>
             </w:pPr>
             <w:r>
-              <w:t xml:space="preserve">25.1 gmacs</w:t>
-            </w:r>
-            <w:r>
-              <w:t xml:space="preserve"> </w:t>
-            </w:r>
-            <w:r>
-              <w:t xml:space="preserve">(update +</w:t>
-            </w:r>
-            <w:r>
-              <w:t xml:space="preserve"> </w:t>
-            </w:r>
-            <w:r>
-              <w:t xml:space="preserve">plus</w:t>
-            </w:r>
-            <w:r>
-              <w:t xml:space="preserve"> </w:t>
-            </w:r>
-            <w:r>
-              <w:t xml:space="preserve">group)</w:t>
+              <w:t xml:space="preserve">u+pg</w:t>
             </w:r>
           </w:p>
         </w:tc>
@@ -25113,25 +24074,7 @@
               <w:jc w:val="left"/>
             </w:pPr>
             <w:r>
-              <w:t xml:space="preserve">25.1 gmacs</w:t>
-            </w:r>
-            <w:r>
-              <w:t xml:space="preserve"> </w:t>
-            </w:r>
-            <w:r>
-              <w:t xml:space="preserve">(update +</w:t>
-            </w:r>
-            <w:r>
-              <w:t xml:space="preserve"> </w:t>
-            </w:r>
-            <w:r>
-              <w:t xml:space="preserve">plus</w:t>
-            </w:r>
-            <w:r>
-              <w:t xml:space="preserve"> </w:t>
-            </w:r>
-            <w:r>
-              <w:t xml:space="preserve">group)</w:t>
+              <w:t xml:space="preserve">u+pg</w:t>
             </w:r>
           </w:p>
         </w:tc>

</xml_diff>